<commit_message>
Accuracy pass: fix dates, citations, initiative maths and budget scenarios
Co-Authored-By: Claude Opus 5.5 <noreply@anthropic.com>
Claude-Session: https://claude.ai/code/session_01V2NJtrYy3bzNxqKeiRXJfY
</commit_message>
<xml_diff>
--- a/operation_uptime/Operation_Uptime_Memo.docx
+++ b/operation_uptime/Operation_Uptime_Memo.docx
@@ -63,7 +63,7 @@
         <w:t xml:space="preserve">The real constraint: </w:t>
       </w:r>
       <w:r>
-        <w:t>Your recruiters' 55 assessments a week are the limit, not money. Applications become signed contracts in ~3 weeks, and few contracts get signed in Christmas week, so the last useful application is Fri 27 Nov (Wed 20 Nov for supervisors). Between Thu 22 Oct and Tue 1 Dec there are ~322 assessment slots. The plan needs ~290 qualified applicants, so 90% of the slots are used. Spending more doesn't add hires before 31 Dec; better-quality applicants and more slots do.</w:t>
+        <w:t>Your recruiters' 55 assessments a week are the limit, not money. Applications become signed contracts in ~3 weeks, and few contracts get signed in Christmas week, so the last useful application is Fri 27 Nov (Fri 20 Nov for supervisors). Between Thu 22 Oct and Tue 1 Dec there are ~322 assessment slots. The plan needs ~290 qualified applicants, so 90% of the slots are used. Spending more doesn't add hires before 31 Dec; better-quality applicants and more slots do.</w:t>
       </w:r>
     </w:p>
     <w:p>
@@ -74,7 +74,7 @@
         <w:t xml:space="preserve">Plan: </w:t>
       </w:r>
       <w:r>
-        <w:t>Buy hires from the cheapest source first and pace arrivals at ≤55 qualified a week. In order of cost per hire: (1) free channels (Tesla careers, BA Jobbörse, Google for Jobs); (2) re-engage past qualified applicants in your ATS (≈€20 per hire); (3) a Polish border corridor for mechatronics, capped at 40% of those hires; (4) a 'Handwerk → Industrie' campaign that turns construction electricians into plant electricians; (5) targeted LinkedIn and Google Search, referrals, and StepStone to close the gaps. Programmatic and Meta run only as €300 tests in weeks 1–2 and act as backup volume. Paid spend stops after 27 Nov.</w:t>
+        <w:t>Buy hires from the cheapest source first and pace arrivals at ≤55 qualified a week. In order of cost per hire: (1) free channels (Tesla careers, BA Jobbörse, Google for Jobs); (2) re-engage past qualified applicants in your ATS (≈€20 per hire); (3) a Polish border corridor for mechatronics, capped at 40% of those hires; (4) a 'Handwerk → Industrie' campaign that turns construction electricians into plant electricians; (5) targeted LinkedIn and Google Search, referrals, and StepStone to close the gaps. Programmatic runs only as €300 tests in weeks 1–2, as does Meta except for mechatronics; both are backup volume. Paid spend stops after 27 Nov.</w:t>
       </w:r>
     </w:p>
     <w:tbl>
@@ -150,7 +150,7 @@
                 <w:color w:val="FFFFFF"/>
                 <w:sz w:val="16"/>
               </w:rPr>
-              <w:t>Qualified needed</w:t>
+              <w:t>Qualified (plan)</w:t>
             </w:r>
           </w:p>
         </w:tc>
@@ -170,7 +170,7 @@
                 <w:color w:val="FFFFFF"/>
                 <w:sz w:val="16"/>
               </w:rPr>
-              <w:t>Applications</w:t>
+              <w:t>Applications (plan)</w:t>
             </w:r>
           </w:p>
         </w:tc>
@@ -865,7 +865,7 @@
         <w:t xml:space="preserve">Smaller budget: </w:t>
       </w:r>
       <w:r>
-        <w:t>With 30% less (~€34k), we sign ~87: all mechatronics and automation, ~24 electricians and ~4 supervisors. The cut lands on the roles that keep the lines running, so I advise against it.</w:t>
+        <w:t>With 30% less (€35k), we sign ~88: all mechatronics and automation, ~24 electricians and ~4 supervisors. The cut lands on the roles that keep the lines running, so I advise against it.</w:t>
       </w:r>
     </w:p>
     <w:p>
@@ -1839,7 +1839,7 @@
         <w:t xml:space="preserve">Where the rates come from. </w:t>
       </w:r>
       <w:r>
-        <w:t>All rates are my own estimates, each with one line of reasoning on the Assumptions tab. Share qualified is low because the brief says most applicants fail the requirements; for electricians, foreign-trained applicants can't be recognised in time (2–4 months, §6 BQFG). Pass rates assume a practical test about half fail. Acceptance reflects counter-offers in Engpass trades; Tesla's pay above the Brandenburg median (€3,030/month, WSI Lohnspiegel) helps. The channel mix in Part 2 changes these figures slightly: 290 qualified and 1,544 applications, because initiatives bring better-screened candidates.</w:t>
+        <w:t>All rates are my own estimates, each with one line of reasoning on the Assumptions tab. Share qualified is low because the brief says most applicants fail the requirements; for electricians, foreign-trained applicants can't be recognised in time (2–4 months, §6 BQFG). Pass rates assume a practical test about half fail. Acceptance reflects counter-offers in Engpass trades; an offer above the Brandenburg median (€3,030/month at 10 years, WSI Lohnspiegel) would help, and pay bands are for the client to confirm. The channel mix in Part 2 changes these figures slightly: 290 qualified and 1,544 applications, because initiatives bring better-screened candidates.</w:t>
       </w:r>
     </w:p>
     <w:p>
@@ -2896,7 +2896,7 @@
         <w:rPr>
           <w:sz w:val="16"/>
         </w:rPr>
-        <w:t>Cells show cost per hire · hires planned. *Media only; €345 including the pre-screener. Cost per application ranges from €12 (Polish boards) to €97 (StepStone, at 15 applications per ad). Shares qualified run from 5% (Meta, electricians) to 50% (rediscovery). Sources: StepStone €1,449 per ad (instaffo.com), Pracuj.pl 1,499 PLN per ad (dlafirm.pracuj.pl), Indeed CPC $0.10–5+ (pin.com), Appcast apply rate 6.1% (2025 benchmark). All other figures are my own estimates.</w:t>
+        <w:t>Cells show cost per hire · hires planned. *Media only; €345 including the pre-screener. Paid cost per application ranges from €12 (Polish boards) to €97 (StepStone, at 15 applications per ad). Shares qualified run from 5% (Meta, electricians) to 50% (rediscovery). Sources: StepStone €1,449 per ad (instaffo.com), Pracuj.pl ~1,499 PLN per ad, indicative (dlafirm.pracuj.pl), Indeed CPC $0.10–5+ (pin.com), Appcast apply rate 6.1% (2025 benchmark). All other figures are my own estimates.</w:t>
       </w:r>
     </w:p>
     <w:p>
@@ -2918,7 +2918,7 @@
         <w:t xml:space="preserve">Allocation. </w:t>
       </w:r>
       <w:r>
-        <w:t>€41.8k planned = €17.9k paid channels + €16.6k initiative media and bonuses + €5.2k initiative fixed costs (Polish pre-screener €3.6k, translation, German creative) + €2.1k of €300 tests on cells outside the plan. The €8.2k reserve (15% of the €49.2k calculated total, rounded up to €50k) stays unallocated until week 3. Weeks are Tue–Mon: 13%, 18%, 18%, 18%, 18%, 15% of spend in weeks 1–6, nothing after 27 Nov. Supervisor spend ends in week 5. Weeks 1–2 spend €14.8k (30%), of which €2.1k is pure learning; the rest is planned cells running under kill rules. Duds are cut on Mon 2 Nov, and the full re-allocation happens on Mon 9 Nov.</w:t>
+        <w:t>€41.8k planned = €17.9k paid channels + €16.6k initiative media and bonuses + €5.2k initiative fixed costs (Polish pre-screener €3.6k, translation, German creative) + €2.1k of €300 tests on cells outside the plan. The €8.2k reserve (15% of the €49.2k calculated total = €7.4k, plus €0.8k from rounding up to €50k) stays unallocated until week 3. Weeks are Tue–Mon: 13%, 18%, 18%, 18%, 18%, 15% of spend in weeks 1–6, nothing after 27 Nov. Supervisor spend ends in week 5. Weeks 1–2 spend €14.8k (30%), of which €2.1k is pure learning; the rest is planned cells running under kill rules. Duds are cut on Mon 2 Nov, and the full re-allocation happens on Mon 9 Nov.</w:t>
       </w:r>
     </w:p>
     <w:p>
@@ -2929,7 +2929,7 @@
         <w:t xml:space="preserve">With less money. </w:t>
       </w:r>
       <w:r>
-        <w:t>Media costs are cut from the most expensive cost per hire first, and the reserve stays at 15%. At –15% (€41.8k) we sign ~95; at –30% (€34.4k) ~87, with electricians at 24 and supervisors at 4; at –50% ~77. Mechatronics and automation never fall short. What I'd tell the client: the last €15k buys ~13 hires at ~€1,150 each, almost all electricians and supervisors. That is cheap compared with one week of an unfilled maintenance shift, so keep it. If you must cut, cover supervisors with internal promotions and protect electricians.</w:t>
+        <w:t>Media costs are cut from the most expensive cost per hire first, and the reserve stays at 15%. At –15% (€42.5k) we sign ~95; at –30% (€35k) ~88, with electricians at 24 and supervisors at 4; at –50% (€25k) ~77. Mechatronics and automation never fall short. What I'd tell the client: the last €15k buys ~12 hires at ~€1,250 each, almost all electricians and supervisors. That is cheap compared with one week of an unfilled maintenance shift, so keep it. If you must cut, cover supervisors with internal promotions and protect electricians.</w:t>
       </w:r>
     </w:p>
     <w:p>
@@ -3280,7 +3280,7 @@
               <w:rPr>
                 <w:sz w:val="15"/>
               </w:rPr>
-              <w:t>€350 messaging + €5.1k bonuses → 84+33 applications, ~31 qualified, ~11 hires (€20 per hire for rediscovery, €1,000 for referrals)</w:t>
+              <w:t>€350 messaging + €5.1k bonuses → 84 re-applications + 32 referrals, ~56 qualified, ~22 hires (~€21 per hire for rediscovery, €1,000 for referrals)</w:t>
             </w:r>
           </w:p>
         </w:tc>
@@ -3350,7 +3350,7 @@
               <w:rPr>
                 <w:sz w:val="15"/>
               </w:rPr>
-              <w:t>€4.4k (incl. bonuses accrued). Works if ≥15 qualified (≥5 electricians) by day 14. Kill: &lt;5 qualified → stop waves (bonus stays: it costs only on a hire)</w:t>
+              <w:t>€350 of messaging (bonuses are paid only on signed hires, from week 4). Works if ≥15 qualified (≥5 electricians) by day 14. Kill: &lt;5 qualified → stop waves (bonus stays: it costs only on a hire)</w:t>
             </w:r>
           </w:p>
         </w:tc>

</xml_diff>

<commit_message>
Fix audit findings: full-cost ranking, cash timing, test sizing, tracker forecast, wording
Co-Authored-By: Claude Opus 5.5 <noreply@anthropic.com>
Claude-Session: https://claude.ai/code/session_01V2NJtrYy3bzNxqKeiRXJfY
</commit_message>
<xml_diff>
--- a/operation_uptime/Operation_Uptime_Memo.docx
+++ b/operation_uptime/Operation_Uptime_Memo.docx
@@ -52,7 +52,7 @@
         <w:t xml:space="preserve">Recommended budget: </w:t>
       </w:r>
       <w:r>
-        <w:t>€50,000. That is €41.8k of planned spend plus an €8.2k reserve that we release only on results. Expected media cost per hire: ~€420 planned and ≤€500 if the reserve is used. This excludes Joveo fees and your internal costs.</w:t>
+        <w:t>€52,500. That is €43.6k of planned spend plus an €8.9k reserve that we release only on results. Expected media cost per hire: ~€436 planned and ≤€525 if the reserve is used. This excludes Joveo fees and your internal costs.</w:t>
       </w:r>
     </w:p>
     <w:p>
@@ -74,7 +74,7 @@
         <w:t xml:space="preserve">Plan: </w:t>
       </w:r>
       <w:r>
-        <w:t>Buy hires from the cheapest source first and pace arrivals at ≤55 qualified a week. In order of cost per hire: (1) free channels (Tesla careers, BA Jobbörse, Google for Jobs); (2) re-engage past qualified applicants in your ATS (≈€20 per hire); (3) a Polish border corridor for mechatronics, capped at 40% of those hires; (4) a 'Handwerk → Industrie' campaign that turns construction electricians into plant electricians; (5) targeted LinkedIn and Google Search, referrals, and StepStone to close the gaps. Programmatic runs only as €300 tests in weeks 1–2, as does Meta except for mechatronics; both are backup volume. Paid spend stops after 27 Nov.</w:t>
+        <w:t>Buy hires from the cheapest source first and pace arrivals at ≤55 qualified a week. Roughly in order of cost per hire: (1) free channels (Tesla careers, BA Jobbörse, Google for Jobs); (2) re-engage past qualified applicants in your ATS (≈€20 per hire); (3) a Polish border corridor for mechatronics with a Polish-speaking pre-screener (≈€220 per hire, capped at 40% of those hires); (4) a 'Handwerk → Industrie' campaign that turns construction electricians into plant electricians; (5) targeted LinkedIn and Google Search, referrals, and StepStone to close the gaps. Programmatic runs only as €750 tests in weeks 1–2, as does Meta except for mechatronics; both are backup volume. Paid spend stops after 27 Nov.</w:t>
       </w:r>
     </w:p>
     <w:tbl>
@@ -88,10 +88,10 @@
         <w:gridCol w:w="1247"/>
         <w:gridCol w:w="623"/>
         <w:gridCol w:w="907"/>
-        <w:gridCol w:w="907"/>
+        <w:gridCol w:w="1020"/>
         <w:gridCol w:w="737"/>
-        <w:gridCol w:w="907"/>
-        <w:gridCol w:w="4649"/>
+        <w:gridCol w:w="850"/>
+        <w:gridCol w:w="4592"/>
       </w:tblGrid>
       <w:tr>
         <w:tc>
@@ -156,7 +156,7 @@
         </w:tc>
         <w:tc>
           <w:tcPr>
-            <w:tcW w:type="dxa" w:w="907"/>
+            <w:tcW w:type="dxa" w:w="1020"/>
             <w:shd w:val="clear" w:color="auto" w:fill="1F3864"/>
           </w:tcPr>
           <w:p>
@@ -196,7 +196,7 @@
         </w:tc>
         <w:tc>
           <w:tcPr>
-            <w:tcW w:type="dxa" w:w="907"/>
+            <w:tcW w:type="dxa" w:w="850"/>
             <w:shd w:val="clear" w:color="auto" w:fill="1F3864"/>
           </w:tcPr>
           <w:p>
@@ -216,7 +216,7 @@
         </w:tc>
         <w:tc>
           <w:tcPr>
-            <w:tcW w:type="dxa" w:w="4649"/>
+            <w:tcW w:type="dxa" w:w="4592"/>
             <w:shd w:val="clear" w:color="auto" w:fill="1F3864"/>
           </w:tcPr>
           <w:p>
@@ -230,7 +230,7 @@
                 <w:color w:val="FFFFFF"/>
                 <w:sz w:val="16"/>
               </w:rPr>
-              <w:t>Main sources</w:t>
+              <w:t>Main sources (hires)</w:t>
             </w:r>
           </w:p>
         </w:tc>
@@ -289,7 +289,7 @@
         </w:tc>
         <w:tc>
           <w:tcPr>
-            <w:tcW w:type="dxa" w:w="907"/>
+            <w:tcW w:type="dxa" w:w="1020"/>
           </w:tcPr>
           <w:p>
             <w:pPr>
@@ -317,13 +317,13 @@
               <w:rPr>
                 <w:sz w:val="16"/>
               </w:rPr>
-              <w:t>€20.5k</w:t>
+              <w:t>€21.4k</w:t>
             </w:r>
           </w:p>
         </w:tc>
         <w:tc>
           <w:tcPr>
-            <w:tcW w:type="dxa" w:w="907"/>
+            <w:tcW w:type="dxa" w:w="850"/>
           </w:tcPr>
           <w:p>
             <w:pPr>
@@ -334,13 +334,13 @@
               <w:rPr>
                 <w:sz w:val="16"/>
               </w:rPr>
-              <w:t>€682</w:t>
+              <w:t>€712</w:t>
             </w:r>
           </w:p>
         </w:tc>
         <w:tc>
           <w:tcPr>
-            <w:tcW w:type="dxa" w:w="4649"/>
+            <w:tcW w:type="dxa" w:w="4592"/>
           </w:tcPr>
           <w:p>
             <w:pPr>
@@ -410,7 +410,7 @@
         </w:tc>
         <w:tc>
           <w:tcPr>
-            <w:tcW w:type="dxa" w:w="907"/>
+            <w:tcW w:type="dxa" w:w="1020"/>
           </w:tcPr>
           <w:p>
             <w:pPr>
@@ -438,13 +438,13 @@
               <w:rPr>
                 <w:sz w:val="16"/>
               </w:rPr>
-              <w:t>€8.0k</w:t>
+              <w:t>€7.1k</w:t>
             </w:r>
           </w:p>
         </w:tc>
         <w:tc>
           <w:tcPr>
-            <w:tcW w:type="dxa" w:w="907"/>
+            <w:tcW w:type="dxa" w:w="850"/>
           </w:tcPr>
           <w:p>
             <w:pPr>
@@ -455,13 +455,13 @@
               <w:rPr>
                 <w:sz w:val="16"/>
               </w:rPr>
-              <w:t>€177</w:t>
+              <w:t>€157</w:t>
             </w:r>
           </w:p>
         </w:tc>
         <w:tc>
           <w:tcPr>
-            <w:tcW w:type="dxa" w:w="4649"/>
+            <w:tcW w:type="dxa" w:w="4592"/>
           </w:tcPr>
           <w:p>
             <w:pPr>
@@ -531,7 +531,7 @@
         </w:tc>
         <w:tc>
           <w:tcPr>
-            <w:tcW w:type="dxa" w:w="907"/>
+            <w:tcW w:type="dxa" w:w="1020"/>
           </w:tcPr>
           <w:p>
             <w:pPr>
@@ -559,13 +559,13 @@
               <w:rPr>
                 <w:sz w:val="16"/>
               </w:rPr>
-              <w:t>€6.8k</w:t>
+              <w:t>€7.7k</w:t>
             </w:r>
           </w:p>
         </w:tc>
         <w:tc>
           <w:tcPr>
-            <w:tcW w:type="dxa" w:w="907"/>
+            <w:tcW w:type="dxa" w:w="850"/>
           </w:tcPr>
           <w:p>
             <w:pPr>
@@ -576,13 +576,13 @@
               <w:rPr>
                 <w:sz w:val="16"/>
               </w:rPr>
-              <w:t>€452</w:t>
+              <w:t>€512</w:t>
             </w:r>
           </w:p>
         </w:tc>
         <w:tc>
           <w:tcPr>
-            <w:tcW w:type="dxa" w:w="4649"/>
+            <w:tcW w:type="dxa" w:w="4592"/>
           </w:tcPr>
           <w:p>
             <w:pPr>
@@ -652,7 +652,7 @@
         </w:tc>
         <w:tc>
           <w:tcPr>
-            <w:tcW w:type="dxa" w:w="907"/>
+            <w:tcW w:type="dxa" w:w="1020"/>
           </w:tcPr>
           <w:p>
             <w:pPr>
@@ -680,13 +680,13 @@
               <w:rPr>
                 <w:sz w:val="16"/>
               </w:rPr>
-              <w:t>€6.6k</w:t>
+              <w:t>€7.5k</w:t>
             </w:r>
           </w:p>
         </w:tc>
         <w:tc>
           <w:tcPr>
-            <w:tcW w:type="dxa" w:w="907"/>
+            <w:tcW w:type="dxa" w:w="850"/>
           </w:tcPr>
           <w:p>
             <w:pPr>
@@ -697,13 +697,13 @@
               <w:rPr>
                 <w:sz w:val="16"/>
               </w:rPr>
-              <w:t>€658</w:t>
+              <w:t>€748</w:t>
             </w:r>
           </w:p>
         </w:tc>
         <w:tc>
           <w:tcPr>
-            <w:tcW w:type="dxa" w:w="4649"/>
+            <w:tcW w:type="dxa" w:w="4592"/>
           </w:tcPr>
           <w:p>
             <w:pPr>
@@ -773,7 +773,7 @@
         </w:tc>
         <w:tc>
           <w:tcPr>
-            <w:tcW w:type="dxa" w:w="907"/>
+            <w:tcW w:type="dxa" w:w="1020"/>
           </w:tcPr>
           <w:p>
             <w:pPr>
@@ -801,13 +801,13 @@
               <w:rPr>
                 <w:sz w:val="16"/>
               </w:rPr>
-              <w:t>€41.8k</w:t>
+              <w:t>€43.6k</w:t>
             </w:r>
           </w:p>
         </w:tc>
         <w:tc>
           <w:tcPr>
-            <w:tcW w:type="dxa" w:w="907"/>
+            <w:tcW w:type="dxa" w:w="850"/>
           </w:tcPr>
           <w:p>
             <w:pPr>
@@ -818,13 +818,13 @@
               <w:rPr>
                 <w:sz w:val="16"/>
               </w:rPr>
-              <w:t>€418</w:t>
+              <w:t>€436</w:t>
             </w:r>
           </w:p>
         </w:tc>
         <w:tc>
           <w:tcPr>
-            <w:tcW w:type="dxa" w:w="4649"/>
+            <w:tcW w:type="dxa" w:w="4592"/>
           </w:tcPr>
           <w:p>
             <w:pPr>
@@ -835,7 +835,7 @@
               <w:rPr>
                 <w:sz w:val="16"/>
               </w:rPr>
-              <w:t>+ €8.2k reserve = €50k</w:t>
+              <w:t>+ €8.9k reserve = €52.5k</w:t>
             </w:r>
           </w:p>
         </w:tc>
@@ -854,7 +854,7 @@
         <w:t xml:space="preserve">How sure am I: </w:t>
       </w:r>
       <w:r>
-        <w:t>~60% that we sign all 100 by 31 Dec, ~85% that we sign at least 90, and a floor of ~78 if pass or acceptance rates come in 30% below plan. This is my own judgement, based on the 90% slot use and the sensitivity test in Part 1.</w:t>
+        <w:t>~60% that we sign all 100 by 31 Dec, and ~85% that we sign at least 90. In the case where pass or acceptance rates come in 30% below plan, we sign ~78. The percentages are my own judgement, based on the 90% slot use and the sensitivity test in Part 1.</w:t>
       </w:r>
     </w:p>
     <w:p>
@@ -865,7 +865,7 @@
         <w:t xml:space="preserve">Smaller budget: </w:t>
       </w:r>
       <w:r>
-        <w:t>With 30% less (€35k), we sign ~88: all mechatronics and automation, ~24 electricians and ~4 supervisors. The cut lands on the roles that keep the lines running, so I advise against it.</w:t>
+        <w:t>With 30% less (€36.75k), we sign ~87: all mechatronics and automation, ~19 electricians and ~8 supervisors. Electricians fall short first, and they're the role that keeps the lines running, so I advise against the cut.</w:t>
       </w:r>
     </w:p>
     <w:p>
@@ -910,7 +910,7 @@
         <w:t>2. Electrician supply.</w:t>
       </w:r>
       <w:r>
-        <w:t xml:space="preserve"> ~12 of the 30 depend on you accepting construction electricians (Elektroniker EGT + Elektrofachkraft + 2 years) with an in-house bridge. → I need a decision by Fri 23 Oct. If it's no, the reserve moves to StepStone and programmatic for electricians at ~€1,000–1,500 per hire, and we expect ~3–5 fewer electricians.</w:t>
+        <w:t xml:space="preserve"> ~12 of the 30 depend on you accepting construction electricians (Elektroniker EGT + Elektrofachkraft + 2 years) with an in-house bridge. → I need a decision by Fri 23 Oct. If it's no, the money moves to StepStone and programmatic for electricians at ~€1,000–1,500 per hire, and we expect ~3–5 fewer electricians.</w:t>
       </w:r>
     </w:p>
     <w:p>
@@ -926,7 +926,7 @@
         <w:t>3. Christmas and offer speed.</w:t>
       </w:r>
       <w:r>
-        <w:t xml:space="preserve"> Late offers or hesitant candidates push signatures past 18 Dec. → Offers within 3 days of interview, e-signature, an 'offer valid 7 days' clause, all paid spend stopped after 27 Nov, and acceptance tracked weekly.</w:t>
+        <w:t xml:space="preserve"> Late offers or hesitant candidates push signatures past 18 Dec. → Offers within 3 days of interview, e-signature, an 'offer valid 7 days' clause, all paid spend stopped after 27 Nov, and acceptance tracked weekly from week 4.</w:t>
       </w:r>
     </w:p>
     <w:p>
@@ -944,7 +944,7 @@
     </w:p>
     <w:p>
       <w:r>
-        <w:t>(1) 55 assessments a week from Thu 22 Oct to Tue 1 Dec, plus 10–15 extra if possible. (2) A day-1 ATS export of past qualified applicants for these titles, with GDPR consent confirmed, and source tags (utm) carried into the ATS. (3) Approval of a €1,000 referral bonus and one internal message to maintenance staff. (4) Your EGT-electrician decision by 23 Oct. (5) A 3-day offer turnaround and e-signature until 18 Dec. (6) Budget approval of €50k, with the reserve released by the rules in Part 4.</w:t>
+        <w:t>(1) 55 assessments a week from Thu 22 Oct to Tue 1 Dec, plus 10–15 extra if possible. (2) A day-1 ATS export of past qualified applicants for these titles, with GDPR consent confirmed, and source tags (utm) carried into the ATS. (3) Approval of a €1,000 referral bonus and one internal message to maintenance staff. (4) Your EGT-electrician decision by 23 Oct. (5) A 3-day offer turnaround and e-signature until 18 Dec. (6) Budget approval of €52.5k, with the reserve released by the rules in Part 4.</w:t>
       </w:r>
     </w:p>
     <w:p>
@@ -1839,7 +1839,7 @@
         <w:t xml:space="preserve">Where the rates come from. </w:t>
       </w:r>
       <w:r>
-        <w:t>All rates are my own estimates, each with one line of reasoning on the Assumptions tab. Share qualified is low because the brief says most applicants fail the requirements; for electricians, foreign-trained applicants can't be recognised in time (2–4 months, §6 BQFG). Pass rates assume a practical test about half fail. Acceptance reflects counter-offers in Engpass trades; an offer above the Brandenburg median (€3,030/month at 10 years, WSI Lohnspiegel) would help, and pay bands are for the client to confirm. The channel mix in Part 2 changes these figures slightly: 290 qualified and 1,544 applications, because initiatives bring better-screened candidates.</w:t>
+        <w:t>All rates are my own estimates, each with one line of reasoning on the Assumptions tab. Share qualified is low because the brief says most applicants fail the requirements; for electricians, foreign-trained applicants can't be recognised in time (2–4 months, §6 BQFG). Pass rates assume a practical test about half fail. Acceptance reflects counter-offers in Engpass trades; an offer above the Brandenburg median (€3,030/month, WSI Lohnspiegel, standardised to 10 years' experience) would help, and pay bands are for the client to confirm. The channel mix in Part 2 changes these figures slightly: 290 qualified and 1,544 applications, because initiatives bring better-screened candidates.</w:t>
       </w:r>
     </w:p>
     <w:p>
@@ -1861,7 +1861,7 @@
         <w:t xml:space="preserve">Hardest role: </w:t>
       </w:r>
       <w:r>
-        <w:t>Electricians. They are the largest scarce block (30). Channel capacity covers only 1.9× the openings (mechatronics 3.2×). The plan needs ~17% of everyone reachable within 75 km, there is no Polish route and no foreign-trained route by 31 Dec, and energy/grid, rail, aerospace and agencies all want the same certificate. Supervisors are close on coverage, but they're only 10 hires and have an internal-promotion fallback.</w:t>
+        <w:t>Electricians. They are the largest scarce block (30), with channel capacity of only 1.9× the openings (mechatronics 3.2×). The plan needs ~17% of the reachable pool (people within 75 km plus relocators; this excludes the construction electricians targeted in Part 3). There is no Polish route and no foreign-trained route by 31 Dec, and energy/grid, rail, aerospace and agencies all want the same certificate. Supervisors have even lower coverage (1.8×), but they're only 10 hires and have an internal-promotion fallback.</w:t>
       </w:r>
     </w:p>
     <w:p>
@@ -1896,7 +1896,7 @@
         <w:t xml:space="preserve">Method. </w:t>
       </w:r>
       <w:r>
-        <w:t>For each role, sources are ranked by cost per hire = cost per application ÷ share qualified ÷ qualified-to-signed rate. The model fills the cheapest first, up to each source's realistic volume, until hires equal openings. The Polish 40% cap is built into the corridor's capacity, and StepStone is bought in whole €1,449 ads. Each source's realistic volume is checked against the reachable talent pool (Pool tab).</w:t>
+        <w:t>For each role, sources are ranked by cost per hire at full capacity: (cost per application × applications + fixed set-up) ÷ hires, where hires = applications × share qualified × qualified-to-signed rate. The model fills the cheapest first, up to each source's realistic volume, until hires equal openings. The Polish 40% cap is built into the corridor's capacity, and StepStone is bought in whole €1,449 ads. Each source's realistic volume is checked against the reachable talent pool (Pool tab).</w:t>
       </w:r>
     </w:p>
     <w:tbl>
@@ -1907,16 +1907,16 @@
         <w:tblLook w:firstColumn="1" w:firstRow="1" w:lastColumn="0" w:lastRow="0" w:noHBand="0" w:noVBand="1" w:val="04A0"/>
       </w:tblPr>
       <w:tblGrid>
-        <w:gridCol w:w="3628"/>
-        <w:gridCol w:w="1587"/>
-        <w:gridCol w:w="1587"/>
-        <w:gridCol w:w="1474"/>
-        <w:gridCol w:w="1474"/>
+        <w:gridCol w:w="3402"/>
+        <w:gridCol w:w="1701"/>
+        <w:gridCol w:w="1644"/>
+        <w:gridCol w:w="1530"/>
+        <w:gridCol w:w="1530"/>
       </w:tblGrid>
       <w:tr>
         <w:tc>
           <w:tcPr>
-            <w:tcW w:type="dxa" w:w="3628"/>
+            <w:tcW w:type="dxa" w:w="3402"/>
             <w:shd w:val="clear" w:color="auto" w:fill="1F3864"/>
           </w:tcPr>
           <w:p>
@@ -1928,7 +1928,7 @@
               <w:rPr>
                 <w:b/>
                 <w:color w:val="FFFFFF"/>
-                <w:sz w:val="16"/>
+                <w:sz w:val="15"/>
               </w:rPr>
               <w:t>Channel (why)</w:t>
             </w:r>
@@ -1936,7 +1936,7 @@
         </w:tc>
         <w:tc>
           <w:tcPr>
-            <w:tcW w:type="dxa" w:w="1587"/>
+            <w:tcW w:type="dxa" w:w="1701"/>
             <w:shd w:val="clear" w:color="auto" w:fill="1F3864"/>
           </w:tcPr>
           <w:p>
@@ -1948,7 +1948,7 @@
               <w:rPr>
                 <w:b/>
                 <w:color w:val="FFFFFF"/>
-                <w:sz w:val="16"/>
+                <w:sz w:val="15"/>
               </w:rPr>
               <w:t>Electricians</w:t>
             </w:r>
@@ -1956,7 +1956,7 @@
         </w:tc>
         <w:tc>
           <w:tcPr>
-            <w:tcW w:type="dxa" w:w="1587"/>
+            <w:tcW w:type="dxa" w:w="1644"/>
             <w:shd w:val="clear" w:color="auto" w:fill="1F3864"/>
           </w:tcPr>
           <w:p>
@@ -1968,7 +1968,7 @@
               <w:rPr>
                 <w:b/>
                 <w:color w:val="FFFFFF"/>
-                <w:sz w:val="16"/>
+                <w:sz w:val="15"/>
               </w:rPr>
               <w:t>Mechatronics</w:t>
             </w:r>
@@ -1976,7 +1976,7 @@
         </w:tc>
         <w:tc>
           <w:tcPr>
-            <w:tcW w:type="dxa" w:w="1474"/>
+            <w:tcW w:type="dxa" w:w="1531"/>
             <w:shd w:val="clear" w:color="auto" w:fill="1F3864"/>
           </w:tcPr>
           <w:p>
@@ -1988,7 +1988,7 @@
               <w:rPr>
                 <w:b/>
                 <w:color w:val="FFFFFF"/>
-                <w:sz w:val="16"/>
+                <w:sz w:val="15"/>
               </w:rPr>
               <w:t>Automation</w:t>
             </w:r>
@@ -1996,7 +1996,7 @@
         </w:tc>
         <w:tc>
           <w:tcPr>
-            <w:tcW w:type="dxa" w:w="1474"/>
+            <w:tcW w:type="dxa" w:w="1531"/>
             <w:shd w:val="clear" w:color="auto" w:fill="1F3864"/>
           </w:tcPr>
           <w:p>
@@ -2008,7 +2008,7 @@
               <w:rPr>
                 <w:b/>
                 <w:color w:val="FFFFFF"/>
-                <w:sz w:val="16"/>
+                <w:sz w:val="15"/>
               </w:rPr>
               <w:t>Supervisors</w:t>
             </w:r>
@@ -2018,7 +2018,7 @@
       <w:tr>
         <w:tc>
           <w:tcPr>
-            <w:tcW w:type="dxa" w:w="3628"/>
+            <w:tcW w:type="dxa" w:w="3402"/>
           </w:tcPr>
           <w:p>
             <w:pPr>
@@ -2027,7 +2027,7 @@
             <w:r/>
             <w:r>
               <w:rPr>
-                <w:sz w:val="16"/>
+                <w:sz w:val="15"/>
               </w:rPr>
               <w:t>Organic: careers, BA Jobbörse, Google for Jobs (free, brand pull)</w:t>
             </w:r>
@@ -2035,7 +2035,7 @@
         </w:tc>
         <w:tc>
           <w:tcPr>
-            <w:tcW w:type="dxa" w:w="1587"/>
+            <w:tcW w:type="dxa" w:w="1701"/>
           </w:tcPr>
           <w:p>
             <w:pPr>
@@ -2044,15 +2044,15 @@
             <w:r/>
             <w:r>
               <w:rPr>
-                <w:sz w:val="16"/>
+                <w:sz w:val="15"/>
               </w:rPr>
-              <w:t>€0 · 3.9</w:t>
+              <w:t>€0 / €0 · 3.9</w:t>
             </w:r>
           </w:p>
         </w:tc>
         <w:tc>
           <w:tcPr>
-            <w:tcW w:type="dxa" w:w="1587"/>
+            <w:tcW w:type="dxa" w:w="1644"/>
           </w:tcPr>
           <w:p>
             <w:pPr>
@@ -2061,15 +2061,15 @@
             <w:r/>
             <w:r>
               <w:rPr>
-                <w:sz w:val="16"/>
+                <w:sz w:val="15"/>
               </w:rPr>
-              <w:t>€0 · 14.6</w:t>
+              <w:t>€0 / €0 · 14.6</w:t>
             </w:r>
           </w:p>
         </w:tc>
         <w:tc>
           <w:tcPr>
-            <w:tcW w:type="dxa" w:w="1474"/>
+            <w:tcW w:type="dxa" w:w="1531"/>
           </w:tcPr>
           <w:p>
             <w:pPr>
@@ -2078,15 +2078,15 @@
             <w:r/>
             <w:r>
               <w:rPr>
-                <w:sz w:val="16"/>
+                <w:sz w:val="15"/>
               </w:rPr>
-              <w:t>€0 · 2.3</w:t>
+              <w:t>€0 / €0 · 2.3</w:t>
             </w:r>
           </w:p>
         </w:tc>
         <w:tc>
           <w:tcPr>
-            <w:tcW w:type="dxa" w:w="1474"/>
+            <w:tcW w:type="dxa" w:w="1531"/>
           </w:tcPr>
           <w:p>
             <w:pPr>
@@ -2095,9 +2095,9 @@
             <w:r/>
             <w:r>
               <w:rPr>
-                <w:sz w:val="16"/>
+                <w:sz w:val="15"/>
               </w:rPr>
-              <w:t>€0 · 1.3</w:t>
+              <w:t>€0 / €0 · 1.3</w:t>
             </w:r>
           </w:p>
         </w:tc>
@@ -2105,7 +2105,7 @@
       <w:tr>
         <w:tc>
           <w:tcPr>
-            <w:tcW w:type="dxa" w:w="3628"/>
+            <w:tcW w:type="dxa" w:w="3402"/>
           </w:tcPr>
           <w:p>
             <w:pPr>
@@ -2114,7 +2114,7 @@
             <w:r/>
             <w:r>
               <w:rPr>
-                <w:sz w:val="16"/>
+                <w:sz w:val="15"/>
               </w:rPr>
               <w:t>I1a ATS rediscovery (already screened)</w:t>
             </w:r>
@@ -2122,7 +2122,7 @@
         </w:tc>
         <w:tc>
           <w:tcPr>
-            <w:tcW w:type="dxa" w:w="1587"/>
+            <w:tcW w:type="dxa" w:w="1701"/>
           </w:tcPr>
           <w:p>
             <w:pPr>
@@ -2131,15 +2131,15 @@
             <w:r/>
             <w:r>
               <w:rPr>
-                <w:sz w:val="16"/>
+                <w:sz w:val="15"/>
               </w:rPr>
-              <w:t>€23 · 4.4</w:t>
+              <w:t>€8 / €23 · 4.4</w:t>
             </w:r>
           </w:p>
         </w:tc>
         <w:tc>
           <w:tcPr>
-            <w:tcW w:type="dxa" w:w="1587"/>
+            <w:tcW w:type="dxa" w:w="1644"/>
           </w:tcPr>
           <w:p>
             <w:pPr>
@@ -2148,15 +2148,15 @@
             <w:r/>
             <w:r>
               <w:rPr>
-                <w:sz w:val="16"/>
+                <w:sz w:val="15"/>
               </w:rPr>
-              <w:t>€18 · 8.4</w:t>
+              <w:t>€8 / €18 · 8.4</w:t>
             </w:r>
           </w:p>
         </w:tc>
         <w:tc>
           <w:tcPr>
-            <w:tcW w:type="dxa" w:w="1474"/>
+            <w:tcW w:type="dxa" w:w="1531"/>
           </w:tcPr>
           <w:p>
             <w:pPr>
@@ -2165,15 +2165,15 @@
             <w:r/>
             <w:r>
               <w:rPr>
-                <w:sz w:val="16"/>
+                <w:sz w:val="15"/>
               </w:rPr>
-              <w:t>€25 · 2.4</w:t>
+              <w:t>€8 / €25 · 2.4</w:t>
             </w:r>
           </w:p>
         </w:tc>
         <w:tc>
           <w:tcPr>
-            <w:tcW w:type="dxa" w:w="1474"/>
+            <w:tcW w:type="dxa" w:w="1531"/>
           </w:tcPr>
           <w:p>
             <w:pPr>
@@ -2182,9 +2182,9 @@
             <w:r/>
             <w:r>
               <w:rPr>
-                <w:sz w:val="16"/>
+                <w:sz w:val="15"/>
               </w:rPr>
-              <w:t>€27 · 1.5</w:t>
+              <w:t>€8 / €27 · 1.5</w:t>
             </w:r>
           </w:p>
         </w:tc>
@@ -2192,7 +2192,7 @@
       <w:tr>
         <w:tc>
           <w:tcPr>
-            <w:tcW w:type="dxa" w:w="3628"/>
+            <w:tcW w:type="dxa" w:w="3402"/>
           </w:tcPr>
           <w:p>
             <w:pPr>
@@ -2201,15 +2201,15 @@
             <w:r/>
             <w:r>
               <w:rPr>
-                <w:sz w:val="16"/>
+                <w:sz w:val="15"/>
               </w:rPr>
-              <w:t>I3 Polish corridor (border commuters; 40% cap)</w:t>
+              <w:t>I3 Polish corridor + pre-screen (40% cap)</w:t>
             </w:r>
           </w:p>
         </w:tc>
         <w:tc>
           <w:tcPr>
-            <w:tcW w:type="dxa" w:w="1587"/>
+            <w:tcW w:type="dxa" w:w="1701"/>
           </w:tcPr>
           <w:p>
             <w:pPr>
@@ -2218,7 +2218,7 @@
             <w:r/>
             <w:r>
               <w:rPr>
-                <w:sz w:val="16"/>
+                <w:sz w:val="15"/>
               </w:rPr>
               <w:t>–</w:t>
             </w:r>
@@ -2226,7 +2226,7 @@
         </w:tc>
         <w:tc>
           <w:tcPr>
-            <w:tcW w:type="dxa" w:w="1587"/>
+            <w:tcW w:type="dxa" w:w="1644"/>
           </w:tcPr>
           <w:p>
             <w:pPr>
@@ -2235,15 +2235,15 @@
             <w:r/>
             <w:r>
               <w:rPr>
-                <w:sz w:val="16"/>
+                <w:sz w:val="15"/>
               </w:rPr>
-              <w:t>€122* · 18</w:t>
+              <w:t>€89 / €221 · 18</w:t>
             </w:r>
           </w:p>
         </w:tc>
         <w:tc>
           <w:tcPr>
-            <w:tcW w:type="dxa" w:w="1474"/>
+            <w:tcW w:type="dxa" w:w="1531"/>
           </w:tcPr>
           <w:p>
             <w:pPr>
@@ -2252,7 +2252,7 @@
             <w:r/>
             <w:r>
               <w:rPr>
-                <w:sz w:val="16"/>
+                <w:sz w:val="15"/>
               </w:rPr>
               <w:t>–</w:t>
             </w:r>
@@ -2260,7 +2260,7 @@
         </w:tc>
         <w:tc>
           <w:tcPr>
-            <w:tcW w:type="dxa" w:w="1474"/>
+            <w:tcW w:type="dxa" w:w="1531"/>
           </w:tcPr>
           <w:p>
             <w:pPr>
@@ -2269,7 +2269,7 @@
             <w:r/>
             <w:r>
               <w:rPr>
-                <w:sz w:val="16"/>
+                <w:sz w:val="15"/>
               </w:rPr>
               <w:t>–</w:t>
             </w:r>
@@ -2279,7 +2279,7 @@
       <w:tr>
         <w:tc>
           <w:tcPr>
-            <w:tcW w:type="dxa" w:w="3628"/>
+            <w:tcW w:type="dxa" w:w="3402"/>
           </w:tcPr>
           <w:p>
             <w:pPr>
@@ -2288,7 +2288,7 @@
             <w:r/>
             <w:r>
               <w:rPr>
-                <w:sz w:val="16"/>
+                <w:sz w:val="15"/>
               </w:rPr>
               <w:t>Meta lead ads (passive blue-collar reach)</w:t>
             </w:r>
@@ -2296,7 +2296,7 @@
         </w:tc>
         <w:tc>
           <w:tcPr>
-            <w:tcW w:type="dxa" w:w="1587"/>
+            <w:tcW w:type="dxa" w:w="1701"/>
           </w:tcPr>
           <w:p>
             <w:pPr>
@@ -2305,15 +2305,15 @@
             <w:r/>
             <w:r>
               <w:rPr>
-                <w:sz w:val="16"/>
+                <w:sz w:val="15"/>
               </w:rPr>
-              <w:t>€1,119 · test</w:t>
+              <w:t>€360 / €1,119 · test</w:t>
             </w:r>
           </w:p>
         </w:tc>
         <w:tc>
           <w:tcPr>
-            <w:tcW w:type="dxa" w:w="1587"/>
+            <w:tcW w:type="dxa" w:w="1644"/>
           </w:tcPr>
           <w:p>
             <w:pPr>
@@ -2322,15 +2322,15 @@
             <w:r/>
             <w:r>
               <w:rPr>
-                <w:sz w:val="16"/>
+                <w:sz w:val="15"/>
               </w:rPr>
-              <w:t>€247 · 4.0</w:t>
+              <w:t>€100 / €247 · 4.0</w:t>
             </w:r>
           </w:p>
         </w:tc>
         <w:tc>
           <w:tcPr>
-            <w:tcW w:type="dxa" w:w="1474"/>
+            <w:tcW w:type="dxa" w:w="1531"/>
           </w:tcPr>
           <w:p>
             <w:pPr>
@@ -2339,7 +2339,7 @@
             <w:r/>
             <w:r>
               <w:rPr>
-                <w:sz w:val="16"/>
+                <w:sz w:val="15"/>
               </w:rPr>
               <w:t>–</w:t>
             </w:r>
@@ -2347,7 +2347,7 @@
         </w:tc>
         <w:tc>
           <w:tcPr>
-            <w:tcW w:type="dxa" w:w="1474"/>
+            <w:tcW w:type="dxa" w:w="1531"/>
           </w:tcPr>
           <w:p>
             <w:pPr>
@@ -2356,7 +2356,7 @@
             <w:r/>
             <w:r>
               <w:rPr>
-                <w:sz w:val="16"/>
+                <w:sz w:val="15"/>
               </w:rPr>
               <w:t>–</w:t>
             </w:r>
@@ -2366,7 +2366,7 @@
       <w:tr>
         <w:tc>
           <w:tcPr>
-            <w:tcW w:type="dxa" w:w="3628"/>
+            <w:tcW w:type="dxa" w:w="3402"/>
           </w:tcPr>
           <w:p>
             <w:pPr>
@@ -2375,15 +2375,15 @@
             <w:r/>
             <w:r>
               <w:rPr>
-                <w:sz w:val="16"/>
+                <w:sz w:val="15"/>
               </w:rPr>
-              <w:t>Google Search (high intent, low volume)</w:t>
+              <w:t>Programmatic (Indeed, Jooble, Talent.com…)</w:t>
             </w:r>
           </w:p>
         </w:tc>
         <w:tc>
           <w:tcPr>
-            <w:tcW w:type="dxa" w:w="1587"/>
+            <w:tcW w:type="dxa" w:w="1701"/>
           </w:tcPr>
           <w:p>
             <w:pPr>
@@ -2392,15 +2392,15 @@
             <w:r/>
             <w:r>
               <w:rPr>
-                <w:sz w:val="16"/>
+                <w:sz w:val="15"/>
               </w:rPr>
-              <w:t>€651 · 3.9</w:t>
+              <w:t>€476 / €1,480 · test</w:t>
             </w:r>
           </w:p>
         </w:tc>
         <w:tc>
           <w:tcPr>
-            <w:tcW w:type="dxa" w:w="1587"/>
+            <w:tcW w:type="dxa" w:w="1644"/>
           </w:tcPr>
           <w:p>
             <w:pPr>
@@ -2409,15 +2409,15 @@
             <w:r/>
             <w:r>
               <w:rPr>
-                <w:sz w:val="16"/>
+                <w:sz w:val="15"/>
               </w:rPr>
-              <w:t>€310 · test</w:t>
+              <w:t>€109 / €269 · backup</w:t>
             </w:r>
           </w:p>
         </w:tc>
         <w:tc>
           <w:tcPr>
-            <w:tcW w:type="dxa" w:w="1474"/>
+            <w:tcW w:type="dxa" w:w="1531"/>
           </w:tcPr>
           <w:p>
             <w:pPr>
@@ -2426,15 +2426,15 @@
             <w:r/>
             <w:r>
               <w:rPr>
-                <w:sz w:val="16"/>
+                <w:sz w:val="15"/>
               </w:rPr>
-              <w:t>€716 · test</w:t>
+              <w:t>€375 / €1,282 · test</w:t>
             </w:r>
           </w:p>
         </w:tc>
         <w:tc>
           <w:tcPr>
-            <w:tcW w:type="dxa" w:w="1474"/>
+            <w:tcW w:type="dxa" w:w="1531"/>
           </w:tcPr>
           <w:p>
             <w:pPr>
@@ -2443,9 +2443,9 @@
             <w:r/>
             <w:r>
               <w:rPr>
-                <w:sz w:val="16"/>
+                <w:sz w:val="15"/>
               </w:rPr>
-              <w:t>€978 · 1.0</w:t>
+              <w:t>€425 / €1,587 · test</w:t>
             </w:r>
           </w:p>
         </w:tc>
@@ -2453,7 +2453,7 @@
       <w:tr>
         <w:tc>
           <w:tcPr>
-            <w:tcW w:type="dxa" w:w="3628"/>
+            <w:tcW w:type="dxa" w:w="3402"/>
           </w:tcPr>
           <w:p>
             <w:pPr>
@@ -2462,15 +2462,15 @@
             <w:r/>
             <w:r>
               <w:rPr>
-                <w:sz w:val="16"/>
+                <w:sz w:val="15"/>
               </w:rPr>
-              <w:t>I2 Handwerk → Industrie (new pool)</w:t>
+              <w:t>Google Search (high intent, low volume)</w:t>
             </w:r>
           </w:p>
         </w:tc>
         <w:tc>
           <w:tcPr>
-            <w:tcW w:type="dxa" w:w="1587"/>
+            <w:tcW w:type="dxa" w:w="1701"/>
           </w:tcPr>
           <w:p>
             <w:pPr>
@@ -2479,15 +2479,15 @@
             <w:r/>
             <w:r>
               <w:rPr>
-                <w:sz w:val="16"/>
+                <w:sz w:val="15"/>
               </w:rPr>
-              <w:t>€777 · 11.6</w:t>
+              <w:t>€210 / €651 · 3.9</w:t>
             </w:r>
           </w:p>
         </w:tc>
         <w:tc>
           <w:tcPr>
-            <w:tcW w:type="dxa" w:w="1587"/>
+            <w:tcW w:type="dxa" w:w="1644"/>
           </w:tcPr>
           <w:p>
             <w:pPr>
@@ -2496,15 +2496,15 @@
             <w:r/>
             <w:r>
               <w:rPr>
-                <w:sz w:val="16"/>
+                <w:sz w:val="15"/>
               </w:rPr>
-              <w:t>–</w:t>
+              <w:t>€126 / €310 · test</w:t>
             </w:r>
           </w:p>
         </w:tc>
         <w:tc>
           <w:tcPr>
-            <w:tcW w:type="dxa" w:w="1474"/>
+            <w:tcW w:type="dxa" w:w="1531"/>
           </w:tcPr>
           <w:p>
             <w:pPr>
@@ -2513,15 +2513,15 @@
             <w:r/>
             <w:r>
               <w:rPr>
-                <w:sz w:val="16"/>
+                <w:sz w:val="15"/>
               </w:rPr>
-              <w:t>–</w:t>
+              <w:t>€210 / €716 · test</w:t>
             </w:r>
           </w:p>
         </w:tc>
         <w:tc>
           <w:tcPr>
-            <w:tcW w:type="dxa" w:w="1474"/>
+            <w:tcW w:type="dxa" w:w="1531"/>
           </w:tcPr>
           <w:p>
             <w:pPr>
@@ -2530,7 +2530,181 @@
             <w:r/>
             <w:r>
               <w:rPr>
-                <w:sz w:val="16"/>
+                <w:sz w:val="15"/>
+              </w:rPr>
+              <w:t>€262 / €978 · 1.0</w:t>
+            </w:r>
+          </w:p>
+        </w:tc>
+      </w:tr>
+      <w:tr>
+        <w:tc>
+          <w:tcPr>
+            <w:tcW w:type="dxa" w:w="3402"/>
+          </w:tcPr>
+          <w:p>
+            <w:pPr>
+              <w:spacing w:after="0"/>
+            </w:pPr>
+            <w:r/>
+            <w:r>
+              <w:rPr>
+                <w:sz w:val="15"/>
+              </w:rPr>
+              <w:t>LinkedIn (PLC/TIA and Meister live here)</w:t>
+            </w:r>
+          </w:p>
+        </w:tc>
+        <w:tc>
+          <w:tcPr>
+            <w:tcW w:type="dxa" w:w="1701"/>
+          </w:tcPr>
+          <w:p>
+            <w:pPr>
+              <w:spacing w:after="0"/>
+            </w:pPr>
+            <w:r/>
+            <w:r>
+              <w:rPr>
+                <w:sz w:val="15"/>
+              </w:rPr>
+              <w:t>–</w:t>
+            </w:r>
+          </w:p>
+        </w:tc>
+        <w:tc>
+          <w:tcPr>
+            <w:tcW w:type="dxa" w:w="1644"/>
+          </w:tcPr>
+          <w:p>
+            <w:pPr>
+              <w:spacing w:after="0"/>
+            </w:pPr>
+            <w:r/>
+            <w:r>
+              <w:rPr>
+                <w:sz w:val="15"/>
+              </w:rPr>
+              <w:t>–</w:t>
+            </w:r>
+          </w:p>
+        </w:tc>
+        <w:tc>
+          <w:tcPr>
+            <w:tcW w:type="dxa" w:w="1531"/>
+          </w:tcPr>
+          <w:p>
+            <w:pPr>
+              <w:spacing w:after="0"/>
+            </w:pPr>
+            <w:r/>
+            <w:r>
+              <w:rPr>
+                <w:sz w:val="15"/>
+              </w:rPr>
+              <w:t>€175 / €598 · 10.2</w:t>
+            </w:r>
+          </w:p>
+        </w:tc>
+        <w:tc>
+          <w:tcPr>
+            <w:tcW w:type="dxa" w:w="1531"/>
+          </w:tcPr>
+          <w:p>
+            <w:pPr>
+              <w:spacing w:after="0"/>
+            </w:pPr>
+            <w:r/>
+            <w:r>
+              <w:rPr>
+                <w:sz w:val="15"/>
+              </w:rPr>
+              <w:t>€219 / €817 · 5.4</w:t>
+            </w:r>
+          </w:p>
+        </w:tc>
+      </w:tr>
+      <w:tr>
+        <w:tc>
+          <w:tcPr>
+            <w:tcW w:type="dxa" w:w="3402"/>
+          </w:tcPr>
+          <w:p>
+            <w:pPr>
+              <w:spacing w:after="0"/>
+            </w:pPr>
+            <w:r/>
+            <w:r>
+              <w:rPr>
+                <w:sz w:val="15"/>
+              </w:rPr>
+              <w:t>I2 Handwerk → Industrie (new pool)</w:t>
+            </w:r>
+          </w:p>
+        </w:tc>
+        <w:tc>
+          <w:tcPr>
+            <w:tcW w:type="dxa" w:w="1701"/>
+          </w:tcPr>
+          <w:p>
+            <w:pPr>
+              <w:spacing w:after="0"/>
+            </w:pPr>
+            <w:r/>
+            <w:r>
+              <w:rPr>
+                <w:sz w:val="15"/>
+              </w:rPr>
+              <w:t>€200 / €881 · 11.6</w:t>
+            </w:r>
+          </w:p>
+        </w:tc>
+        <w:tc>
+          <w:tcPr>
+            <w:tcW w:type="dxa" w:w="1644"/>
+          </w:tcPr>
+          <w:p>
+            <w:pPr>
+              <w:spacing w:after="0"/>
+            </w:pPr>
+            <w:r/>
+            <w:r>
+              <w:rPr>
+                <w:sz w:val="15"/>
+              </w:rPr>
+              <w:t>–</w:t>
+            </w:r>
+          </w:p>
+        </w:tc>
+        <w:tc>
+          <w:tcPr>
+            <w:tcW w:type="dxa" w:w="1531"/>
+          </w:tcPr>
+          <w:p>
+            <w:pPr>
+              <w:spacing w:after="0"/>
+            </w:pPr>
+            <w:r/>
+            <w:r>
+              <w:rPr>
+                <w:sz w:val="15"/>
+              </w:rPr>
+              <w:t>–</w:t>
+            </w:r>
+          </w:p>
+        </w:tc>
+        <w:tc>
+          <w:tcPr>
+            <w:tcW w:type="dxa" w:w="1531"/>
+          </w:tcPr>
+          <w:p>
+            <w:pPr>
+              <w:spacing w:after="0"/>
+            </w:pPr>
+            <w:r/>
+            <w:r>
+              <w:rPr>
+                <w:sz w:val="15"/>
               </w:rPr>
               <w:t>–</w:t>
             </w:r>
@@ -2540,7 +2714,7 @@
       <w:tr>
         <w:tc>
           <w:tcPr>
-            <w:tcW w:type="dxa" w:w="3628"/>
+            <w:tcW w:type="dxa" w:w="3402"/>
           </w:tcPr>
           <w:p>
             <w:pPr>
@@ -2549,15 +2723,15 @@
             <w:r/>
             <w:r>
               <w:rPr>
-                <w:sz w:val="16"/>
+                <w:sz w:val="15"/>
               </w:rPr>
-              <w:t>LinkedIn (PLC/TIA and Meister live here)</w:t>
+              <w:t>I1b Referrals (€1,000 bonus on hire)</w:t>
             </w:r>
           </w:p>
         </w:tc>
         <w:tc>
           <w:tcPr>
-            <w:tcW w:type="dxa" w:w="1587"/>
+            <w:tcW w:type="dxa" w:w="1701"/>
           </w:tcPr>
           <w:p>
             <w:pPr>
@@ -2566,15 +2740,15 @@
             <w:r/>
             <w:r>
               <w:rPr>
-                <w:sz w:val="16"/>
+                <w:sz w:val="15"/>
               </w:rPr>
-              <w:t>–</w:t>
+              <w:t>€370 / €1,000 · 4.2</w:t>
             </w:r>
           </w:p>
         </w:tc>
         <w:tc>
           <w:tcPr>
-            <w:tcW w:type="dxa" w:w="1587"/>
+            <w:tcW w:type="dxa" w:w="1644"/>
           </w:tcPr>
           <w:p>
             <w:pPr>
@@ -2583,15 +2757,15 @@
             <w:r/>
             <w:r>
               <w:rPr>
-                <w:sz w:val="16"/>
+                <w:sz w:val="15"/>
               </w:rPr>
-              <w:t>–</w:t>
+              <w:t>€466 / €1,000 · –</w:t>
             </w:r>
           </w:p>
         </w:tc>
         <w:tc>
           <w:tcPr>
-            <w:tcW w:type="dxa" w:w="1474"/>
+            <w:tcW w:type="dxa" w:w="1531"/>
           </w:tcPr>
           <w:p>
             <w:pPr>
@@ -2600,15 +2774,15 @@
             <w:r/>
             <w:r>
               <w:rPr>
-                <w:sz w:val="16"/>
+                <w:sz w:val="15"/>
               </w:rPr>
-              <w:t>€598 · 10.2</w:t>
+              <w:t>€336 / €1,000 · –</w:t>
             </w:r>
           </w:p>
         </w:tc>
         <w:tc>
           <w:tcPr>
-            <w:tcW w:type="dxa" w:w="1474"/>
+            <w:tcW w:type="dxa" w:w="1531"/>
           </w:tcPr>
           <w:p>
             <w:pPr>
@@ -2617,9 +2791,9 @@
             <w:r/>
             <w:r>
               <w:rPr>
-                <w:sz w:val="16"/>
+                <w:sz w:val="15"/>
               </w:rPr>
-              <w:t>€817 · 5.4</w:t>
+              <w:t>€308 / €1,000 · 0.9</w:t>
             </w:r>
           </w:p>
         </w:tc>
@@ -2627,7 +2801,7 @@
       <w:tr>
         <w:tc>
           <w:tcPr>
-            <w:tcW w:type="dxa" w:w="3628"/>
+            <w:tcW w:type="dxa" w:w="3402"/>
           </w:tcPr>
           <w:p>
             <w:pPr>
@@ -2636,15 +2810,15 @@
             <w:r/>
             <w:r>
               <w:rPr>
-                <w:sz w:val="16"/>
+                <w:sz w:val="15"/>
               </w:rPr>
-              <w:t>I1b Referrals (€1,000 bonus on hire)</w:t>
+              <w:t>StepStone (German, CV-based, €1,449 per ad)</w:t>
             </w:r>
           </w:p>
         </w:tc>
         <w:tc>
           <w:tcPr>
-            <w:tcW w:type="dxa" w:w="1587"/>
+            <w:tcW w:type="dxa" w:w="1701"/>
           </w:tcPr>
           <w:p>
             <w:pPr>
@@ -2653,15 +2827,15 @@
             <w:r/>
             <w:r>
               <w:rPr>
-                <w:sz w:val="16"/>
+                <w:sz w:val="15"/>
               </w:rPr>
-              <w:t>€1,000 · 4.2</w:t>
+              <w:t>€322 / €1,001 · 2.1</w:t>
             </w:r>
           </w:p>
         </w:tc>
         <w:tc>
           <w:tcPr>
-            <w:tcW w:type="dxa" w:w="1587"/>
+            <w:tcW w:type="dxa" w:w="1644"/>
           </w:tcPr>
           <w:p>
             <w:pPr>
@@ -2670,15 +2844,15 @@
             <w:r/>
             <w:r>
               <w:rPr>
-                <w:sz w:val="16"/>
+                <w:sz w:val="15"/>
               </w:rPr>
-              <w:t>€1,000 · –</w:t>
+              <w:t>€166 / €409 · –</w:t>
             </w:r>
           </w:p>
         </w:tc>
         <w:tc>
           <w:tcPr>
-            <w:tcW w:type="dxa" w:w="1474"/>
+            <w:tcW w:type="dxa" w:w="1531"/>
           </w:tcPr>
           <w:p>
             <w:pPr>
@@ -2687,15 +2861,15 @@
             <w:r/>
             <w:r>
               <w:rPr>
-                <w:sz w:val="16"/>
+                <w:sz w:val="15"/>
               </w:rPr>
-              <w:t>€1,000 · –</w:t>
+              <w:t>€386 / €1,321 · –</w:t>
             </w:r>
           </w:p>
         </w:tc>
         <w:tc>
           <w:tcPr>
-            <w:tcW w:type="dxa" w:w="1474"/>
+            <w:tcW w:type="dxa" w:w="1531"/>
           </w:tcPr>
           <w:p>
             <w:pPr>
@@ -2704,183 +2878,9 @@
             <w:r/>
             <w:r>
               <w:rPr>
-                <w:sz w:val="16"/>
+                <w:sz w:val="15"/>
               </w:rPr>
-              <w:t>€1,000 · 0.9</w:t>
-            </w:r>
-          </w:p>
-        </w:tc>
-      </w:tr>
-      <w:tr>
-        <w:tc>
-          <w:tcPr>
-            <w:tcW w:type="dxa" w:w="3628"/>
-          </w:tcPr>
-          <w:p>
-            <w:pPr>
-              <w:spacing w:after="0"/>
-            </w:pPr>
-            <w:r/>
-            <w:r>
-              <w:rPr>
-                <w:sz w:val="16"/>
-              </w:rPr>
-              <w:t>StepStone (German, CV-based, €1,449 per ad)</w:t>
-            </w:r>
-          </w:p>
-        </w:tc>
-        <w:tc>
-          <w:tcPr>
-            <w:tcW w:type="dxa" w:w="1587"/>
-          </w:tcPr>
-          <w:p>
-            <w:pPr>
-              <w:spacing w:after="0"/>
-            </w:pPr>
-            <w:r/>
-            <w:r>
-              <w:rPr>
-                <w:sz w:val="16"/>
-              </w:rPr>
-              <w:t>€1,001 · 2.1</w:t>
-            </w:r>
-          </w:p>
-        </w:tc>
-        <w:tc>
-          <w:tcPr>
-            <w:tcW w:type="dxa" w:w="1587"/>
-          </w:tcPr>
-          <w:p>
-            <w:pPr>
-              <w:spacing w:after="0"/>
-            </w:pPr>
-            <w:r/>
-            <w:r>
-              <w:rPr>
-                <w:sz w:val="16"/>
-              </w:rPr>
-              <w:t>€409 · backup</w:t>
-            </w:r>
-          </w:p>
-        </w:tc>
-        <w:tc>
-          <w:tcPr>
-            <w:tcW w:type="dxa" w:w="1474"/>
-          </w:tcPr>
-          <w:p>
-            <w:pPr>
-              <w:spacing w:after="0"/>
-            </w:pPr>
-            <w:r/>
-            <w:r>
-              <w:rPr>
-                <w:sz w:val="16"/>
-              </w:rPr>
-              <w:t>€1,321 · –</w:t>
-            </w:r>
-          </w:p>
-        </w:tc>
-        <w:tc>
-          <w:tcPr>
-            <w:tcW w:type="dxa" w:w="1474"/>
-          </w:tcPr>
-          <w:p>
-            <w:pPr>
-              <w:spacing w:after="0"/>
-            </w:pPr>
-            <w:r/>
-            <w:r>
-              <w:rPr>
-                <w:sz w:val="16"/>
-              </w:rPr>
-              <w:t>€1,443 · –</w:t>
-            </w:r>
-          </w:p>
-        </w:tc>
-      </w:tr>
-      <w:tr>
-        <w:tc>
-          <w:tcPr>
-            <w:tcW w:type="dxa" w:w="3628"/>
-          </w:tcPr>
-          <w:p>
-            <w:pPr>
-              <w:spacing w:after="0"/>
-            </w:pPr>
-            <w:r/>
-            <w:r>
-              <w:rPr>
-                <w:sz w:val="16"/>
-              </w:rPr>
-              <w:t>Programmatic (Indeed, Jooble, Talent.com…)</w:t>
-            </w:r>
-          </w:p>
-        </w:tc>
-        <w:tc>
-          <w:tcPr>
-            <w:tcW w:type="dxa" w:w="1587"/>
-          </w:tcPr>
-          <w:p>
-            <w:pPr>
-              <w:spacing w:after="0"/>
-            </w:pPr>
-            <w:r/>
-            <w:r>
-              <w:rPr>
-                <w:sz w:val="16"/>
-              </w:rPr>
-              <w:t>€1,480 · test</w:t>
-            </w:r>
-          </w:p>
-        </w:tc>
-        <w:tc>
-          <w:tcPr>
-            <w:tcW w:type="dxa" w:w="1587"/>
-          </w:tcPr>
-          <w:p>
-            <w:pPr>
-              <w:spacing w:after="0"/>
-            </w:pPr>
-            <w:r/>
-            <w:r>
-              <w:rPr>
-                <w:sz w:val="16"/>
-              </w:rPr>
-              <w:t>€269 · backup</w:t>
-            </w:r>
-          </w:p>
-        </w:tc>
-        <w:tc>
-          <w:tcPr>
-            <w:tcW w:type="dxa" w:w="1474"/>
-          </w:tcPr>
-          <w:p>
-            <w:pPr>
-              <w:spacing w:after="0"/>
-            </w:pPr>
-            <w:r/>
-            <w:r>
-              <w:rPr>
-                <w:sz w:val="16"/>
-              </w:rPr>
-              <w:t>€1,282 · test</w:t>
-            </w:r>
-          </w:p>
-        </w:tc>
-        <w:tc>
-          <w:tcPr>
-            <w:tcW w:type="dxa" w:w="1474"/>
-          </w:tcPr>
-          <w:p>
-            <w:pPr>
-              <w:spacing w:after="0"/>
-            </w:pPr>
-            <w:r/>
-            <w:r>
-              <w:rPr>
-                <w:sz w:val="16"/>
-              </w:rPr>
-              <w:t>€1,587 · test</w:t>
+              <w:t>€386 / €1,443 · –</w:t>
             </w:r>
           </w:p>
         </w:tc>
@@ -2896,7 +2896,7 @@
         <w:rPr>
           <w:sz w:val="16"/>
         </w:rPr>
-        <w:t>Cells show cost per hire · hires planned. *Media only; €345 including the pre-screener. Paid cost per application ranges from €12 (Polish boards) to €97 (StepStone, at 15 applications per ad). Shares qualified run from 5% (Meta, electricians) to 50% (rediscovery). Sources: StepStone €1,449 per ad (instaffo.com), Pracuj.pl ~1,499 PLN per ad, indicative (dlafirm.pracuj.pl), Indeed CPC $0.10–5+ (pin.com), Appcast apply rate 6.1% (2025 benchmark). All other figures are my own estimates.</w:t>
+        <w:t>Cells show cost per qualified / cost per hire · hires planned. Cost per hire includes set-up costs (I2 €1,200, I3 €400 translation). StepStone's planned cost per hire is €1,385 because ads are bought whole. Paid cost per application ranges from €12 (Polish boards; €19.50 with the pre-screen call) to €97 (StepStone, at 15 applications per ad); rediscovery costs €4. Sources: StepStone €1,449 per ad (instaffo.com), Pracuj.pl ~1,499 PLN per ad, indicative (dlafirm.pracuj.pl), Indeed CPC $0.10–5+ (pin.com), LinkedIn CPC $4–8 (peoplebox.ai), Appcast apply rate 6.1% (2025 benchmark). All other figures are my own estimates.</w:t>
       </w:r>
     </w:p>
     <w:p>
@@ -2907,7 +2907,7 @@
         <w:t xml:space="preserve">What the ranking says. </w:t>
       </w:r>
       <w:r>
-        <w:t>Mechatronics is cheap and deep: programmatic (€269 per hire, ~53 hires of capacity) is unused only because cheaper sources cover the need, so it's the first place the reserve goes if organic or Polish volume falls short. Electricians are the opposite: every source beyond the first ~20 hires costs €750–1,500.</w:t>
+        <w:t>Mechatronics is cheap and deep: programmatic (€269 per hire, ~53 hires of capacity) is unused only because cheaper sources (Polish corridor €221, Meta €247) cover the need, so it's the first place the reserve goes if organic or Polish volume falls short. Electricians are the opposite: every source beyond the first ~8 hires costs €650–1,500.</w:t>
       </w:r>
     </w:p>
     <w:p>
@@ -2918,7 +2918,7 @@
         <w:t xml:space="preserve">Allocation. </w:t>
       </w:r>
       <w:r>
-        <w:t>€41.8k planned = €17.9k paid channels + €16.6k initiative media and bonuses + €5.2k initiative fixed costs (Polish pre-screener €3.6k, translation, German creative) + €2.1k of €300 tests on cells outside the plan. The €8.2k reserve (15% of the €49.2k calculated total = €7.4k, plus €0.8k from rounding up to €50k) stays unallocated until week 3. Weeks are Tue–Mon: 13%, 18%, 18%, 18%, 18%, 15% of spend in weeks 1–6, nothing after 27 Nov. Supervisor spend ends in week 5. Weeks 1–2 spend €14.8k (30%), of which €2.1k is pure learning; the rest is planned cells running under kill rules. Duds are cut on Mon 2 Nov, and the full re-allocation happens on Mon 9 Nov.</w:t>
+        <w:t>€43.6k planned = €17.9k paid channels + €18.0k initiative media, pre-screen calls and referral bonuses + €1.6k set-up + €6.1k of €750 tests on cells outside the plan. The reserve is €8.9k: 15% of the €51.3k calculated total (€7.7k) plus €1.2k from rounding up to €52.5k. It stays unallocated until week 3. CPC/CPA media follows 13%, 18%, 18%, 18%, 18%, 15% across weeks 1–6 (Tue–Mon), and supervisor spend ends in week 5. StepStone ads and set-up are paid in week 1, tests across weeks 1–2, and referral bonuses as hires sign (weeks 4–9). Weeks 1–2 cash is €19.6k (37%), of which €6.1k is test money and €2.9k is StepStone ads. On Mon 2 Nov we cut planned cells that break the rules once they pass €500 or 30 applications; tests and the full re-allocation are judged on Mon 9 Nov.</w:t>
       </w:r>
     </w:p>
     <w:p>
@@ -2929,7 +2929,7 @@
         <w:t xml:space="preserve">With less money. </w:t>
       </w:r>
       <w:r>
-        <w:t>Media costs are cut from the most expensive cost per hire first, and the reserve stays at 15%. At –15% (€42.5k) we sign ~95; at –30% (€35k) ~88, with electricians at 24 and supervisors at 4; at –50% (€25k) ~77. Mechatronics and automation never fall short. What I'd tell the client: the last €15k buys ~12 hires at ~€1,250 each, almost all electricians and supervisors. That is cheap compared with one week of an unfilled maintenance shift, so keep it. If you must cut, cover supervisors with internal promotions and protect electricians.</w:t>
+        <w:t>Media is cut from the most expensive cost per hire first, and the reserve stays at 15%. At –15% (€44.6k) we sign ~95; at –30% (€36.75k) ~87, with electricians at 19 and supervisors at 8; at –50% (€26.25k) ~76. Mechatronics and automation never fall short. What I'd tell the client: the last €15.75k buys ~13 hires at ~€1,250 each, mostly electricians. That is cheap compared with one week of an unfilled maintenance shift, so keep it. If you must cut, cover supervisors with internal promotions and protect electricians.</w:t>
       </w:r>
     </w:p>
     <w:p>
@@ -2942,7 +2942,7 @@
           <w:color w:val="1F3864"/>
           <w:sz w:val="23"/>
         </w:rPr>
-        <w:t>Part 3: New sources (all funded inside the €50k)</w:t>
+        <w:t>Part 3: New sources (all funded inside the €52.5k)</w:t>
       </w:r>
     </w:p>
     <w:tbl>
@@ -3087,7 +3087,7 @@
               <w:rPr>
                 <w:sz w:val="15"/>
               </w:rPr>
-              <w:t>~12,000 construction electricians (Elektroniker EGT) within 75 km, facing a slow winter on site</w:t>
+              <w:t>~12,000 construction electricians (Elektroniker EGT) within 75 km, many of whom see site work slow in winter (my assumption)</w:t>
             </w:r>
           </w:p>
         </w:tc>
@@ -3174,7 +3174,7 @@
               <w:rPr>
                 <w:sz w:val="15"/>
               </w:rPr>
-              <w:t>Polish ads on Pracuj.pl, OLX Praca and Polish-geo Meta. A remote Polish-speaking freelancer (20 h/week) phones every applicant, checks German/English and shift acceptance, and hands over only qualified ones</w:t>
+              <w:t>Polish ads on Pracuj.pl, OLX Praca and Polish-geo Meta. A remote Polish-speaking freelancer (paid hourly, ~15 min per applicant) phones every applicant, checks German/English and shift acceptance, and hands over only qualified ones</w:t>
             </w:r>
           </w:p>
         </w:tc>
@@ -3227,7 +3227,7 @@
               <w:rPr>
                 <w:sz w:val="15"/>
               </w:rPr>
-              <w:t>Reaches a certified electrical pool that never searches 'Betriebstechnik' jobs; widens the hardest role's pool by ~2×</w:t>
+              <w:t>Reaches a certified electrical pool that doesn't search 'Betriebstechnik' jobs; roughly doubles the hardest role's pool</w:t>
             </w:r>
           </w:p>
         </w:tc>
@@ -3244,7 +3244,7 @@
               <w:rPr>
                 <w:sz w:val="15"/>
               </w:rPr>
-              <w:t>Polish job seekers aren't on German boards. The pre-screen raises the pass rate and saves your 55 slots</w:t>
+              <w:t>Polish job seekers mostly search Polish boards, not German ones. The pre-screen raises the pass rate and saves your 55 slots</w:t>
             </w:r>
           </w:p>
         </w:tc>
@@ -3314,7 +3314,7 @@
               <w:rPr>
                 <w:sz w:val="15"/>
               </w:rPr>
-              <w:t>184 apps × €12 = €2.2k + €4.0k fixed → 40 qualified × 44.6% = 18 hires (the 40% cap; €345 per hire)</w:t>
+              <w:t>184 apps × (€12 ads + €7.50 call) = €3.6k + €0.4k translation → 40 qualified × 44.6% = 18 hires (the 40% cap; €221 per hire)</w:t>
             </w:r>
           </w:p>
         </w:tc>
@@ -3350,7 +3350,7 @@
               <w:rPr>
                 <w:sz w:val="15"/>
               </w:rPr>
-              <w:t>€350 of messaging (bonuses are paid only on signed hires, from week 4). Works if ≥15 qualified (≥5 electricians) by day 14. Kill: &lt;5 qualified → stop waves (bonus stays: it costs only on a hire)</w:t>
+              <w:t>€350 of messaging (bonuses are paid only on signed hires, from week 4). Works if ≥15 qualified (≥5 electricians) by day 14. Kill: &lt;5 qualified → stop the waves; the bonus stays because it costs only on a hire</w:t>
             </w:r>
           </w:p>
         </w:tc>
@@ -3367,7 +3367,7 @@
               <w:rPr>
                 <w:sz w:val="15"/>
               </w:rPr>
-              <w:t>€4.0k. Works if ≥8 qualified at ≤€250 each and ≥50% pass the interview. Kill: &gt;€400 per qualified, &lt;40% pass, or profile rejected → money to StepStone/programmatic</w:t>
+              <w:t>€4.0k. Works if ≥8 qualified at ≤€250 each by day 14, and in week 4 ≥50% of the first 6 interviewed pass. Kill: &gt;€400 per qualified or profile rejected (day 14), or &lt;40% pass (week 4) → money to StepStone/programmatic</w:t>
             </w:r>
           </w:p>
         </w:tc>
@@ -3384,7 +3384,7 @@
               <w:rPr>
                 <w:sz w:val="15"/>
               </w:rPr>
-              <w:t>€2.3k. Works if ≥12 qualified at ≤€80 each. Kill: &lt;6 qualified or &lt;30% language pass → end freelancer (weekly notice)</w:t>
+              <w:t>€1.5k. Works if ≥12 qualified at ≤€80 each. Kill: &lt;6 qualified or &lt;30% pass the language check → stop ads and the freelancer's hours</w:t>
             </w:r>
           </w:p>
         </w:tc>
@@ -3420,7 +3420,7 @@
               <w:rPr>
                 <w:sz w:val="15"/>
               </w:rPr>
-              <w:t>Me: segment the export, write DE copy, tracked links, send waves (3 days set-up). Client: ATS export + consent check, bonus approval, one intranet/shift-briefing message</w:t>
+              <w:t>Me: segment the export and send wave 1 within a day of receiving it; DE copy, tracked links and the 3-wave sequence ready in 3 days. Client: ATS export + consent check, bonus approval, one intranet/shift-briefing message</w:t>
             </w:r>
           </w:p>
         </w:tc>
@@ -3437,7 +3437,7 @@
               <w:rPr>
                 <w:sz w:val="15"/>
               </w:rPr>
-              <w:t>Me: audiences, quiz funnel, brief a remote DE copywriter (€700), go live in 4 days. Client: profile sign-off by 23 Oct, bridge plan, pay line for the ad</w:t>
+              <w:t>Me: audiences, quiz funnel, brief a remote DE copywriter (€700), live by Fri 23 Oct. Client: profile sign-off by 23 Oct, bridge plan, pay line for the ad</w:t>
             </w:r>
           </w:p>
         </w:tc>
@@ -3454,7 +3454,7 @@
               <w:rPr>
                 <w:sz w:val="15"/>
               </w:rPr>
-              <w:t>Me: post ads (day 3), hire the freelancer via Joveo's vendor pool/Useme (live 27 Oct), write script and scorecard, daily 15-min call at 09:00 CET. Client: approve PL ads, shift/commute facts, a German/English interviewer</w:t>
+              <w:t>Me: post ads (day 3), hire the freelancer via Joveo's vendor pool/Useme (live 27 Oct), write script and scorecard, daily 15-min call at 09:00 German time (13:30 IST). Client: approve PL ads, shift/commute facts, a German/English interviewer</w:t>
             </w:r>
           </w:p>
         </w:tc>
@@ -3473,7 +3473,7 @@
         <w:t xml:space="preserve">Which could become a Joveo product: </w:t>
       </w:r>
       <w:r>
-        <w:t>I1a ATS rediscovery. Every large employer has thousands of previously screened candidates sitting in its ATS, and nobody re-markets to them. Here they cost ~€20 per hire against €250–1,500 for paid media, and they're available on day 1 when paid channels are still warming up. That is exactly when the 55 slots would otherwise sit empty. Joveo already matches jobs to supply programmatically. Adding a 'rediscovery' source that matches open reqs to past qualified applicants, re-contacts them with consent and tracks them to hire through the same source tags is a repeatable product priced per qualified applicant, and it works in any market without local staff. The Polish corridor is the second candidate, as a reusable cross-border supply lane for border-region plants.</w:t>
+        <w:t>I1a ATS rediscovery. Every large employer has thousands of previously screened candidates sitting in its ATS, and in my experience they are rarely re-marketed to. Here they cost ~€20 per hire against €220–1,500 for other sources, and they're available on day 1 when paid channels are still warming up. That is exactly when the 55 slots would otherwise sit empty. Joveo already matches jobs to supply programmatically. Adding a 'rediscovery' source that matches open reqs to past qualified applicants, re-contacts them with consent and tracks them to hire through the same source tags is a repeatable product priced per qualified applicant, and it works in any market without local staff. The Polish corridor is the second candidate, as a reusable cross-border supply lane with pay-per-call pre-screening.</w:t>
       </w:r>
     </w:p>
     <w:p>
@@ -3497,7 +3497,7 @@
         <w:t xml:space="preserve">Track. </w:t>
       </w:r>
       <w:r>
-        <w:t>Every Monday, by source × role: spend, clicks, applications, qualified, assessed, passed, offers, signed, cost per qualified, cost per hire, days in stage, and slot use (assessed vs 55). Data comes from the Joveo platform (spend, clicks, applies by tracked URL), a Monday ATS export with the utm source carried into the ATS source field, recruiter disposition codes, and the Polish pre-screener's sheet. A report goes out every Tuesday. The Tracker tab turns actuals into decisions automatically.</w:t>
+        <w:t>Every Monday, by source × role: spend, clicks, applications, qualified, assessed, passed, offers, signed, cost per qualified, cost per hire, days in stage, and slot use (assessed vs 55). Data comes from the Joveo platform (spend, clicks, applies by tracked URL), a Monday ATS export with the utm source carried into the ATS source field, recruiter disposition codes, and the Polish pre-screener's sheet. A report goes out every Tuesday. The Tracker tab turns actuals into decisions and a hire forecast automatically.</w:t>
       </w:r>
     </w:p>
     <w:p>
@@ -3508,7 +3508,7 @@
         <w:t xml:space="preserve">Money rules. </w:t>
       </w:r>
       <w:r>
-        <w:t>No judgement before €500 or 30 applications in a cell. Updated share qualified = (actual qualified + 30 × plan) ÷ (actual applications + 30). Re-forecast cost per qualified ≤0.8× plan with free slots → add 25% a week from the reserve. ≥1.5× → cut 50%. ≥2× plan, or €750 spent with zero qualified → switch off. Capacity overrides everything: if next week's forecast is above 55 qualified, pause the most expensive cells first; if it is below 45, release reserve to the cheapest cells with headroom.</w:t>
+        <w:t>No judgement before €500 or 30 applications in a cell; tests run to €750. Updated share qualified = (actual qualified + 30 × plan) ÷ (actual applications + 30). Re-forecast cost per qualified ≤0.8× plan with free slots → add 25% a week from the reserve. ≥1.5× → cut 50%. ≥2× plan, or €750 spent with zero qualified → switch off. Capacity overrides everything: if next week's forecast is above 55 qualified, pause the most expensive cells first; if it is below 45, release reserve to the cheapest cells with headroom.</w:t>
       </w:r>
     </w:p>
     <w:p>
@@ -3516,7 +3516,7 @@
         <w:rPr>
           <w:b/>
         </w:rPr>
-        <w:t>Week-2 checks (Mon 2 Nov / Mon 9 Nov):</w:t>
+        <w:t>Checks on my assumptions:</w:t>
       </w:r>
       <w:r/>
     </w:p>
@@ -3530,10 +3530,10 @@
         <w:rPr>
           <w:b/>
         </w:rPr>
-        <w:t>Qualified → pass rate by role</w:t>
+        <w:t>Qualified → pass rate by role:</w:t>
       </w:r>
       <w:r>
-        <w:t xml:space="preserve"> (most sensitive). If it is below 45% across roles: tighten knock-out questions, add pre-screen calls for electricians, ask for +10 slots a week, and shift spend toward rediscovery, referrals and StepStone. Re-run the model with the actual rate to show the client the new ceiling.</w:t>
+        <w:t xml:space="preserve"> Week 2 (Mon 9 Nov; the first interviews are from ~29 Oct). This is the most sensitive assumption. If it is below 45% across roles: tighten knock-out questions, add pre-screen calls for electricians, ask for +10 slots a week, and shift spend toward rediscovery, referrals and StepStone. Re-run the model with the actual rate to show the client the new ceiling.</w:t>
       </w:r>
     </w:p>
     <w:p>
@@ -3546,10 +3546,10 @@
         <w:rPr>
           <w:b/>
         </w:rPr>
-        <w:t>Electrician share qualified and I2's result.</w:t>
+        <w:t>Electrician share qualified and I2's result:</w:t>
       </w:r>
       <w:r>
-        <w:t xml:space="preserve"> If the EGT profile is rejected or I2 is below 10% qualified, move I2 and reserve money into StepStone (2 more ads) and programmatic for electricians, and tell the client to expect ~25–27 electricians.</w:t>
+        <w:t xml:space="preserve"> Week 2 (Mon 9 Nov). If the EGT profile is rejected or I2 is below 10% qualified, move I2 and reserve money into StepStone (2 more ads) and programmatic for electricians, and tell the client to expect ~25–27 electricians.</w:t>
       </w:r>
     </w:p>
     <w:p>
@@ -3562,10 +3562,10 @@
         <w:rPr>
           <w:b/>
         </w:rPr>
-        <w:t>Offer speed and acceptance.</w:t>
+        <w:t>Offer speed and acceptance:</w:t>
       </w:r>
       <w:r>
-        <w:t xml:space="preserve"> If acceptance is below 55% or offer → signature takes more than 10 days, pull the application cut-off a week earlier, move spend into weeks 3–5, and propose a signing bonus for contracts signed before 18 Dec.</w:t>
+        <w:t xml:space="preserve"> Week 4 (Mon 16 Nov; the first signatures arrive from ~8 Nov). If acceptance is below 55% or offer → signature takes more than 10 days, pull the application cut-off a week earlier, move spend into weeks 4–5, and propose a signing bonus for contracts signed before 18 Dec.</w:t>
       </w:r>
     </w:p>
     <w:p>
@@ -3583,7 +3583,7 @@
         <w:spacing w:after="20"/>
       </w:pPr>
       <w:r>
-        <w:t>Tue 20 Oct, 09:00 CET (13:30 IST): kick-off with your TA lead. Lock the 55 slots and hiring steps, the 18 Dec signing date, the referral bonus, the EGT decision and utm→ATS source tagging. Request the ATS export.</w:t>
+        <w:t>Tue 20 Oct, 09:00 CEST (12:30 IST): kick-off with your TA lead. Lock the 55 slots and hiring steps, the 18 Dec signing date, the referral bonus, the EGT decision and utm→ATS source tagging. Request the ATS export.</w:t>
       </w:r>
     </w:p>
     <w:p>
@@ -3619,7 +3619,7 @@
         <w:spacing w:after="20"/>
       </w:pPr>
       <w:r>
-        <w:t>Mon 26 Oct: first tracker read-out. Switch off zero-qualified cells, check week-2 qualified volume against 55, confirm the assessment calendar.</w:t>
+        <w:t>Mon 26 Oct: first tracker read-out. Check week-2 qualified volume against 55, confirm the assessment calendar, and pre-book the reserve moves for 2 Nov.</w:t>
       </w:r>
     </w:p>
     <w:sectPr>

</xml_diff>

<commit_message>
Count test-tranche applicants in plan and capacity; fix sensitivity formula, tracker pass-rate lag, kill bars, pool consistency, constants
Co-Authored-By: Claude Opus 5.5 <noreply@anthropic.com>
Claude-Session: https://claude.ai/code/session_01V2NJtrYy3bzNxqKeiRXJfY
</commit_message>
<xml_diff>
--- a/operation_uptime/Operation_Uptime_Memo.docx
+++ b/operation_uptime/Operation_Uptime_Memo.docx
@@ -52,7 +52,7 @@
         <w:t xml:space="preserve">Recommended budget: </w:t>
       </w:r>
       <w:r>
-        <w:t>€52,500. That is €43.6k of planned spend plus an €8.9k reserve that we release only on results. Expected media cost per hire: ~€436 planned and ≤€525 if the reserve is used. This excludes Joveo fees and your internal costs.</w:t>
+        <w:t>€47,500. That is €38.7k of planned spend plus an €8.8k reserve that we release only on results. Expected media cost per hire: ~€387 planned and ≤€475 if the reserve is used. This excludes Joveo fees and your internal costs.</w:t>
       </w:r>
     </w:p>
     <w:p>
@@ -63,7 +63,7 @@
         <w:t xml:space="preserve">The real constraint: </w:t>
       </w:r>
       <w:r>
-        <w:t>Your recruiters' 55 assessments a week are the limit, not money. Applications become signed contracts in ~3 weeks, and few contracts get signed in Christmas week, so the last useful application is Fri 27 Nov (Fri 20 Nov for supervisors). Between Thu 22 Oct and Tue 1 Dec there are ~322 assessment slots. The plan needs ~290 qualified applicants, so 90% of the slots are used. Spending more doesn't add hires before 31 Dec; better-quality applicants and more slots do.</w:t>
+        <w:t>Your recruiters' 55 assessments a week are the limit, not money. Applications become signed contracts in ~3 weeks, and few contracts get signed in Christmas week, so the last useful application is Fri 27 Nov (Fri 20 Nov for supervisors). Between Thu 22 Oct and Tue 1 Dec there are ~322 assessment slots. The plan needs ~291 qualified applicants, so 90% of the slots are used, with weeks 2–5 at 53 of 55. Spending more doesn't add hires before 31 Dec; better-quality applicants and more slots do.</w:t>
       </w:r>
     </w:p>
     <w:p>
@@ -74,7 +74,7 @@
         <w:t xml:space="preserve">Plan: </w:t>
       </w:r>
       <w:r>
-        <w:t>Buy hires from the cheapest source first and pace arrivals at ≤55 qualified a week. Roughly in order of cost per hire: (1) free channels (Tesla careers, BA Jobbörse, Google for Jobs); (2) re-engage past qualified applicants in your ATS (≈€20 per hire); (3) a Polish border corridor for mechatronics with a Polish-speaking pre-screener (≈€220 per hire, capped at 40% of those hires); (4) a 'Handwerk → Industrie' campaign that turns construction electricians into plant electricians; (5) targeted LinkedIn and Google Search, referrals, and StepStone to close the gaps. Programmatic runs only as €750 tests in weeks 1–2, as does Meta except for mechatronics; both are backup volume. Paid spend stops after 27 Nov.</w:t>
+        <w:t>Every paid channel gets a €750 test in weeks 1–2; those applicants are real candidates and are counted. After that we buy hires from the cheapest source first and pace arrivals at ≤55 qualified a week. Roughly in order of cost per hire: (1) free channels (Tesla careers, BA Jobbörse, Google for Jobs); (2) re-engage past qualified applicants in your ATS (≈€20 per hire); (3) a Polish border corridor for mechatronics with a Polish-speaking pre-screener (≈€230 per hire, within the 40% cap); (4) a 'Handwerk → Industrie' campaign that turns construction electricians into plant electricians; (5) targeted LinkedIn and Google Search, referrals, and one StepStone ad to close the gaps. Paid spend stops after 27 Nov.</w:t>
       </w:r>
     </w:p>
     <w:tbl>
@@ -87,11 +87,11 @@
       <w:tblGrid>
         <w:gridCol w:w="1247"/>
         <w:gridCol w:w="623"/>
-        <w:gridCol w:w="907"/>
         <w:gridCol w:w="1020"/>
+        <w:gridCol w:w="1304"/>
         <w:gridCol w:w="737"/>
         <w:gridCol w:w="850"/>
-        <w:gridCol w:w="4592"/>
+        <w:gridCol w:w="4139"/>
       </w:tblGrid>
       <w:tr>
         <w:tc>
@@ -136,7 +136,7 @@
         </w:tc>
         <w:tc>
           <w:tcPr>
-            <w:tcW w:type="dxa" w:w="907"/>
+            <w:tcW w:type="dxa" w:w="1020"/>
             <w:shd w:val="clear" w:color="auto" w:fill="1F3864"/>
           </w:tcPr>
           <w:p>
@@ -156,7 +156,7 @@
         </w:tc>
         <w:tc>
           <w:tcPr>
-            <w:tcW w:type="dxa" w:w="1020"/>
+            <w:tcW w:type="dxa" w:w="1304"/>
             <w:shd w:val="clear" w:color="auto" w:fill="1F3864"/>
           </w:tcPr>
           <w:p>
@@ -170,7 +170,7 @@
                 <w:color w:val="FFFFFF"/>
                 <w:sz w:val="16"/>
               </w:rPr>
-              <w:t>Applications (plan)</w:t>
+              <w:t>Apps (plan)</w:t>
             </w:r>
           </w:p>
         </w:tc>
@@ -216,7 +216,7 @@
         </w:tc>
         <w:tc>
           <w:tcPr>
-            <w:tcW w:type="dxa" w:w="4592"/>
+            <w:tcW w:type="dxa" w:w="4139"/>
             <w:shd w:val="clear" w:color="auto" w:fill="1F3864"/>
           </w:tcPr>
           <w:p>
@@ -272,7 +272,7 @@
         </w:tc>
         <w:tc>
           <w:tcPr>
-            <w:tcW w:type="dxa" w:w="907"/>
+            <w:tcW w:type="dxa" w:w="1020"/>
           </w:tcPr>
           <w:p>
             <w:pPr>
@@ -289,7 +289,7 @@
         </w:tc>
         <w:tc>
           <w:tcPr>
-            <w:tcW w:type="dxa" w:w="1020"/>
+            <w:tcW w:type="dxa" w:w="1304"/>
           </w:tcPr>
           <w:p>
             <w:pPr>
@@ -300,7 +300,7 @@
               <w:rPr>
                 <w:sz w:val="16"/>
               </w:rPr>
-              <w:t>601</w:t>
+              <w:t>643</w:t>
             </w:r>
           </w:p>
         </w:tc>
@@ -317,7 +317,7 @@
               <w:rPr>
                 <w:sz w:val="16"/>
               </w:rPr>
-              <w:t>€21.4k</w:t>
+              <w:t>€19.9k</w:t>
             </w:r>
           </w:p>
         </w:tc>
@@ -334,13 +334,13 @@
               <w:rPr>
                 <w:sz w:val="16"/>
               </w:rPr>
-              <w:t>€712</w:t>
+              <w:t>€664</w:t>
             </w:r>
           </w:p>
         </w:tc>
         <w:tc>
           <w:tcPr>
-            <w:tcW w:type="dxa" w:w="4592"/>
+            <w:tcW w:type="dxa" w:w="4139"/>
           </w:tcPr>
           <w:p>
             <w:pPr>
@@ -351,7 +351,7 @@
               <w:rPr>
                 <w:sz w:val="16"/>
               </w:rPr>
-              <w:t>Handwerk→Industrie 11.6 · rediscovery 4.4 · referrals 4.2 · Google 3.9 · organic 3.9 · StepStone 2.1</w:t>
+              <w:t>Handwerk→Industrie 11.6 · rediscovery 4.4 · referrals 4.2 · Google 3.9 · organic 3.9 · tests/StepStone 2.1</w:t>
             </w:r>
           </w:p>
         </w:tc>
@@ -393,23 +393,6 @@
         </w:tc>
         <w:tc>
           <w:tcPr>
-            <w:tcW w:type="dxa" w:w="907"/>
-          </w:tcPr>
-          <w:p>
-            <w:pPr>
-              <w:spacing w:after="0"/>
-            </w:pPr>
-            <w:r/>
-            <w:r>
-              <w:rPr>
-                <w:sz w:val="16"/>
-              </w:rPr>
-              <w:t>104</w:t>
-            </w:r>
-          </w:p>
-        </w:tc>
-        <w:tc>
-          <w:tcPr>
             <w:tcW w:type="dxa" w:w="1020"/>
           </w:tcPr>
           <w:p>
@@ -421,7 +404,24 @@
               <w:rPr>
                 <w:sz w:val="16"/>
               </w:rPr>
-              <w:t>503</w:t>
+              <w:t>105</w:t>
+            </w:r>
+          </w:p>
+        </w:tc>
+        <w:tc>
+          <w:tcPr>
+            <w:tcW w:type="dxa" w:w="1304"/>
+          </w:tcPr>
+          <w:p>
+            <w:pPr>
+              <w:spacing w:after="0"/>
+            </w:pPr>
+            <w:r/>
+            <w:r>
+              <w:rPr>
+                <w:sz w:val="16"/>
+              </w:rPr>
+              <w:t>494</w:t>
             </w:r>
           </w:p>
         </w:tc>
@@ -438,7 +438,7 @@
               <w:rPr>
                 <w:sz w:val="16"/>
               </w:rPr>
-              <w:t>€7.1k</w:t>
+              <w:t>€5.5k</w:t>
             </w:r>
           </w:p>
         </w:tc>
@@ -455,13 +455,13 @@
               <w:rPr>
                 <w:sz w:val="16"/>
               </w:rPr>
-              <w:t>€157</w:t>
+              <w:t>€123</w:t>
             </w:r>
           </w:p>
         </w:tc>
         <w:tc>
           <w:tcPr>
-            <w:tcW w:type="dxa" w:w="4592"/>
+            <w:tcW w:type="dxa" w:w="4139"/>
           </w:tcPr>
           <w:p>
             <w:pPr>
@@ -472,7 +472,7 @@
               <w:rPr>
                 <w:sz w:val="16"/>
               </w:rPr>
-              <w:t>Polish corridor 18 · organic 14.6 · rediscovery 8.4 · Meta 4.0</w:t>
+              <w:t>organic 14.6 · Polish corridor 13.8 · rediscovery 8.4 · tests 8.2</w:t>
             </w:r>
           </w:p>
         </w:tc>
@@ -514,7 +514,7 @@
         </w:tc>
         <w:tc>
           <w:tcPr>
-            <w:tcW w:type="dxa" w:w="907"/>
+            <w:tcW w:type="dxa" w:w="1020"/>
           </w:tcPr>
           <w:p>
             <w:pPr>
@@ -531,7 +531,7 @@
         </w:tc>
         <w:tc>
           <w:tcPr>
-            <w:tcW w:type="dxa" w:w="1020"/>
+            <w:tcW w:type="dxa" w:w="1304"/>
           </w:tcPr>
           <w:p>
             <w:pPr>
@@ -542,7 +542,7 @@
               <w:rPr>
                 <w:sz w:val="16"/>
               </w:rPr>
-              <w:t>234</w:t>
+              <w:t>253</w:t>
             </w:r>
           </w:p>
         </w:tc>
@@ -559,7 +559,7 @@
               <w:rPr>
                 <w:sz w:val="16"/>
               </w:rPr>
-              <w:t>€7.7k</w:t>
+              <w:t>€6.7k</w:t>
             </w:r>
           </w:p>
         </w:tc>
@@ -576,13 +576,13 @@
               <w:rPr>
                 <w:sz w:val="16"/>
               </w:rPr>
-              <w:t>€512</w:t>
+              <w:t>€447</w:t>
             </w:r>
           </w:p>
         </w:tc>
         <w:tc>
           <w:tcPr>
-            <w:tcW w:type="dxa" w:w="4592"/>
+            <w:tcW w:type="dxa" w:w="4139"/>
           </w:tcPr>
           <w:p>
             <w:pPr>
@@ -593,7 +593,7 @@
               <w:rPr>
                 <w:sz w:val="16"/>
               </w:rPr>
-              <w:t>LinkedIn 10.2 · rediscovery 2.4 · organic 2.3</w:t>
+              <w:t>LinkedIn 8.6 · rediscovery 2.4 · organic 2.3 · tests 1.6</w:t>
             </w:r>
           </w:p>
         </w:tc>
@@ -635,7 +635,7 @@
         </w:tc>
         <w:tc>
           <w:tcPr>
-            <w:tcW w:type="dxa" w:w="907"/>
+            <w:tcW w:type="dxa" w:w="1020"/>
           </w:tcPr>
           <w:p>
             <w:pPr>
@@ -652,7 +652,7 @@
         </w:tc>
         <w:tc>
           <w:tcPr>
-            <w:tcW w:type="dxa" w:w="1020"/>
+            <w:tcW w:type="dxa" w:w="1304"/>
           </w:tcPr>
           <w:p>
             <w:pPr>
@@ -663,7 +663,7 @@
               <w:rPr>
                 <w:sz w:val="16"/>
               </w:rPr>
-              <w:t>206</w:t>
+              <w:t>221</w:t>
             </w:r>
           </w:p>
         </w:tc>
@@ -680,7 +680,7 @@
               <w:rPr>
                 <w:sz w:val="16"/>
               </w:rPr>
-              <w:t>€7.5k</w:t>
+              <w:t>€6.6k</w:t>
             </w:r>
           </w:p>
         </w:tc>
@@ -697,13 +697,13 @@
               <w:rPr>
                 <w:sz w:val="16"/>
               </w:rPr>
-              <w:t>€748</w:t>
+              <w:t>€655</w:t>
             </w:r>
           </w:p>
         </w:tc>
         <w:tc>
           <w:tcPr>
-            <w:tcW w:type="dxa" w:w="4592"/>
+            <w:tcW w:type="dxa" w:w="4139"/>
           </w:tcPr>
           <w:p>
             <w:pPr>
@@ -714,7 +714,7 @@
               <w:rPr>
                 <w:sz w:val="16"/>
               </w:rPr>
-              <w:t>LinkedIn 5.4 · rediscovery 1.5 · organic 1.3 · Google 1.0 · referrals 0.9</w:t>
+              <w:t>LinkedIn 5.4 · rediscovery 1.5 · organic 1.3 · Google 1.0 · other 0.9</w:t>
             </w:r>
           </w:p>
         </w:tc>
@@ -756,23 +756,6 @@
         </w:tc>
         <w:tc>
           <w:tcPr>
-            <w:tcW w:type="dxa" w:w="907"/>
-          </w:tcPr>
-          <w:p>
-            <w:pPr>
-              <w:spacing w:after="0"/>
-            </w:pPr>
-            <w:r/>
-            <w:r>
-              <w:rPr>
-                <w:sz w:val="16"/>
-              </w:rPr>
-              <w:t>290</w:t>
-            </w:r>
-          </w:p>
-        </w:tc>
-        <w:tc>
-          <w:tcPr>
             <w:tcW w:type="dxa" w:w="1020"/>
           </w:tcPr>
           <w:p>
@@ -784,7 +767,24 @@
               <w:rPr>
                 <w:sz w:val="16"/>
               </w:rPr>
-              <w:t>1,544</w:t>
+              <w:t>291</w:t>
+            </w:r>
+          </w:p>
+        </w:tc>
+        <w:tc>
+          <w:tcPr>
+            <w:tcW w:type="dxa" w:w="1304"/>
+          </w:tcPr>
+          <w:p>
+            <w:pPr>
+              <w:spacing w:after="0"/>
+            </w:pPr>
+            <w:r/>
+            <w:r>
+              <w:rPr>
+                <w:sz w:val="16"/>
+              </w:rPr>
+              <w:t>1,611</w:t>
             </w:r>
           </w:p>
         </w:tc>
@@ -801,7 +801,7 @@
               <w:rPr>
                 <w:sz w:val="16"/>
               </w:rPr>
-              <w:t>€43.6k</w:t>
+              <w:t>€38.7k</w:t>
             </w:r>
           </w:p>
         </w:tc>
@@ -818,13 +818,13 @@
               <w:rPr>
                 <w:sz w:val="16"/>
               </w:rPr>
-              <w:t>€436</w:t>
+              <w:t>€387</w:t>
             </w:r>
           </w:p>
         </w:tc>
         <w:tc>
           <w:tcPr>
-            <w:tcW w:type="dxa" w:w="4592"/>
+            <w:tcW w:type="dxa" w:w="4139"/>
           </w:tcPr>
           <w:p>
             <w:pPr>
@@ -835,7 +835,7 @@
               <w:rPr>
                 <w:sz w:val="16"/>
               </w:rPr>
-              <w:t>+ €8.9k reserve = €52.5k</w:t>
+              <w:t>+ €8.8k reserve = €47.5k</w:t>
             </w:r>
           </w:p>
         </w:tc>
@@ -865,7 +865,7 @@
         <w:t xml:space="preserve">Smaller budget: </w:t>
       </w:r>
       <w:r>
-        <w:t>With 30% less (€36.75k), we sign ~87: all mechatronics and automation, ~19 electricians and ~8 supervisors. Electricians fall short first, and they're the role that keeps the lines running, so I advise against the cut.</w:t>
+        <w:t>With 30% less (€33.25k), we sign ~91: all mechatronics, ~14 automation, ~23 electricians and ~8 supervisors. Electricians fall short first, and they're the role that keeps the lines running, so I advise against the cut.</w:t>
       </w:r>
     </w:p>
     <w:p>
@@ -910,7 +910,7 @@
         <w:t>2. Electrician supply.</w:t>
       </w:r>
       <w:r>
-        <w:t xml:space="preserve"> ~12 of the 30 depend on you accepting construction electricians (Elektroniker EGT + Elektrofachkraft + 2 years) with an in-house bridge. → I need a decision by Fri 23 Oct. If it's no, the money moves to StepStone and programmatic for electricians at ~€1,000–1,500 per hire, and we expect ~3–5 fewer electricians.</w:t>
+        <w:t xml:space="preserve"> ~12 of the 30 depend on you accepting construction electricians (Elektroniker EGT + Elektrofachkraft + 2 years) with an in-house bridge. → I need a decision by Fri 23 Oct. If it's no, the money moves to StepStone (up to 2 more ads) and programmatic for electricians at ~€1,000–1,500 per hire, and we expect ~3–5 fewer electricians.</w:t>
       </w:r>
     </w:p>
     <w:p>
@@ -944,7 +944,7 @@
     </w:p>
     <w:p>
       <w:r>
-        <w:t>(1) 55 assessments a week from Thu 22 Oct to Tue 1 Dec, plus 10–15 extra if possible. (2) A day-1 ATS export of past qualified applicants for these titles, with GDPR consent confirmed, and source tags (utm) carried into the ATS. (3) Approval of a €1,000 referral bonus and one internal message to maintenance staff. (4) Your EGT-electrician decision by 23 Oct. (5) A 3-day offer turnaround and e-signature until 18 Dec. (6) Budget approval of €52.5k, with the reserve released by the rules in Part 4.</w:t>
+        <w:t>(1) 55 assessments a week from Thu 22 Oct to Tue 1 Dec, plus 10–15 extra if possible. (2) A day-1 ATS export of past qualified applicants for these titles, with GDPR consent confirmed, and source tags (utm) carried into the ATS. (3) Approval of a €1,000 referral bonus and one internal message to maintenance staff. (4) Your EGT-electrician decision by 23 Oct. (5) A 3-day offer turnaround and e-signature until 18 Dec. (6) Budget approval of €47.5k, with the reserve released by the rules in Part 4.</w:t>
       </w:r>
     </w:p>
     <w:p>
@@ -1014,7 +1014,7 @@
                 <w:color w:val="FFFFFF"/>
                 <w:sz w:val="16"/>
               </w:rPr>
-              <w:t>App→qualified</w:t>
+              <w:t>App → qualified</w:t>
             </w:r>
           </w:p>
         </w:tc>
@@ -1034,7 +1034,7 @@
                 <w:color w:val="FFFFFF"/>
                 <w:sz w:val="16"/>
               </w:rPr>
-              <w:t>Qualified→passed</w:t>
+              <w:t>Qualified → passed</w:t>
             </w:r>
           </w:p>
         </w:tc>
@@ -1054,7 +1054,7 @@
                 <w:color w:val="FFFFFF"/>
                 <w:sz w:val="16"/>
               </w:rPr>
-              <w:t>Passed→offer</w:t>
+              <w:t>Passed → offer</w:t>
             </w:r>
           </w:p>
         </w:tc>
@@ -1074,7 +1074,7 @@
                 <w:color w:val="FFFFFF"/>
                 <w:sz w:val="16"/>
               </w:rPr>
-              <w:t>Offer→signed</w:t>
+              <w:t>Offer → signed</w:t>
             </w:r>
           </w:p>
         </w:tc>
@@ -1094,7 +1094,7 @@
                 <w:color w:val="FFFFFF"/>
                 <w:sz w:val="16"/>
               </w:rPr>
-              <w:t>Qualified→signed</w:t>
+              <w:t>Qualified → signed</w:t>
             </w:r>
           </w:p>
         </w:tc>
@@ -1839,7 +1839,7 @@
         <w:t xml:space="preserve">Where the rates come from. </w:t>
       </w:r>
       <w:r>
-        <w:t>All rates are my own estimates, each with one line of reasoning on the Assumptions tab. Share qualified is low because the brief says most applicants fail the requirements; for electricians, foreign-trained applicants can't be recognised in time (2–4 months, §6 BQFG). Pass rates assume a practical test about half fail. Acceptance reflects counter-offers in Engpass trades; an offer above the Brandenburg median (€3,030/month, WSI Lohnspiegel, standardised to 10 years' experience) would help, and pay bands are for the client to confirm. The channel mix in Part 2 changes these figures slightly: 290 qualified and 1,544 applications, because initiatives bring better-screened candidates.</w:t>
+        <w:t>All rates are my own estimates, each with one line of reasoning on the Assumptions tab. Share qualified is low because the brief says most applicants fail the requirements; for electricians, foreign-trained applicants can't be recognised in time (2–4 months, §6 BQFG). Pass rates assume a practical test about half fail. Acceptance reflects counter-offers in Engpass trades; an offer above the Brandenburg median (€3,030/month, WSI Lohnspiegel, standardised to 10 years' experience) would help, and pay bands are for the client to confirm. The channel mix in Part 2 needs 291 qualified and 1,611 applications (16% fewer applications), because the initiatives bring better-screened candidates.</w:t>
       </w:r>
     </w:p>
     <w:p>
@@ -1850,7 +1850,7 @@
         <w:t xml:space="preserve">Capacity check. </w:t>
       </w:r>
       <w:r>
-        <w:t>Assessment → interview 7 days, → offer 3 days, → signature 7 days, and supervisors add a round (+7 days). With the last realistic signature on Fri 18 Dec, the last useful application is 27 Nov (E/M/A) and 20 Nov (supervisors). 55 × 41 days ÷ 7 = 322 slots against 290 qualified: 90% use, and weeks 2–5 run at 53 of 55.</w:t>
+        <w:t>Assessment → interview 7 days, → offer 3 days, → signature 7 days, and supervisors add a round (+7 days). With the last realistic signature on Fri 18 Dec, the last useful application is 27 Nov (E/M/A) and 20 Nov (supervisors). 55 × 41 days ÷ 7 = 322 slots against 291 qualified: 90% use. Week 1 is 38 of 39 slots, weeks 2–5 are 53 of 55, and week 6 is 41.</w:t>
       </w:r>
     </w:p>
     <w:p>
@@ -1861,7 +1861,7 @@
         <w:t xml:space="preserve">Hardest role: </w:t>
       </w:r>
       <w:r>
-        <w:t>Electricians. They are the largest scarce block (30), with channel capacity of only 1.9× the openings (mechatronics 3.2×). The plan needs ~17% of the reachable pool (people within 75 km plus relocators; this excludes the construction electricians targeted in Part 3). There is no Polish route and no foreign-trained route by 31 Dec, and energy/grid, rail, aerospace and agencies all want the same certificate. Supervisors have even lower coverage (1.8×), but they're only 10 hires and have an internal-promotion fallback.</w:t>
+        <w:t>Electricians. They are the largest scarce block (30), with channel capacity of 1.9× the openings, but only 1.5× without the unproven construction-electrician initiative (I2). That is the lowest of any role (mechatronics 3.2×, automation 2.0×, supervisors 1.8×). There is no Polish route and no foreign-trained route by 31 Dec, and energy/grid, rail, aerospace and agencies all want the same certificate. Supervisors need a bigger share of a smaller pool (17% of reachable people vs 9% for electricians), but they're only 10 hires and have an internal-promotion fallback.</w:t>
       </w:r>
     </w:p>
     <w:p>
@@ -1872,7 +1872,7 @@
         <w:t xml:space="preserve">Most sensitive assumption: </w:t>
       </w:r>
       <w:r>
-        <w:t>Qualified → signed (assessment pass rate, and equally offer acceptance). If it is 30% worse, the plan needs 414 qualified applicants for 322 slots (128%), so at most ~78 hires are possible whatever the budget. Media would also rise ~43%. A 30% worse share qualified or cost per application only costs money (+43% / +30%), and a 30% cut in capacity also gives ~78. This is why the week-2 check focuses on pass rates.</w:t>
+        <w:t>Qualified → signed (assessment pass rate, and equally offer acceptance). If it is 30% worse, the plan needs 415 qualified applicants for 322 slots (129%), so at most ~78 hires are possible whatever the budget. Media would also rise ~43%. A 30% worse share qualified or cost per application only costs money (+43% / +30%), and a 30% cut in capacity also gives ~78. This is why the first check after week 2 is pass rates.</w:t>
       </w:r>
     </w:p>
     <w:p>
@@ -1896,7 +1896,7 @@
         <w:t xml:space="preserve">Method. </w:t>
       </w:r>
       <w:r>
-        <w:t>For each role, sources are ranked by cost per hire at full capacity: (cost per application × applications + fixed set-up) ÷ hires, where hires = applications × share qualified × qualified-to-signed rate. The model fills the cheapest first, up to each source's realistic volume, until hires equal openings. The Polish 40% cap is built into the corridor's capacity, and StepStone is bought in whole €1,449 ads. Each source's realistic volume is checked against the reachable talent pool (Pool tab).</w:t>
+        <w:t>For each role, sources are ranked by cost per hire at full capacity: (cost per application × applications + fixed set-up) ÷ hires, where hires = applications × share qualified × qualified-to-signed rate. Every paid CPC/CPA cell first gets a €750 test in weeks 1–2. Those ~313 applications, ~46 qualified and ~16 expected hires are counted in the plan. The model then fills the remaining need with the cheapest source first, up to each source's realistic volume. The Polish 40% cap is built into the corridor's capacity, and StepStone is bought in whole €1,449 ads. Each source's realistic volume is checked against the reachable talent pool (Pool tab).</w:t>
       </w:r>
     </w:p>
     <w:tbl>
@@ -2237,7 +2237,7 @@
               <w:rPr>
                 <w:sz w:val="15"/>
               </w:rPr>
-              <w:t>€89 / €221 · 18</w:t>
+              <w:t>€89 / €228 · 13.8</w:t>
             </w:r>
           </w:p>
         </w:tc>
@@ -2307,7 +2307,7 @@
               <w:rPr>
                 <w:sz w:val="15"/>
               </w:rPr>
-              <w:t>€360 / €1,119 · test</w:t>
+              <w:t>€360 / €1,119 · 0.7 T</w:t>
             </w:r>
           </w:p>
         </w:tc>
@@ -2324,7 +2324,7 @@
               <w:rPr>
                 <w:sz w:val="15"/>
               </w:rPr>
-              <w:t>€100 / €247 · 4.0</w:t>
+              <w:t>€100 / €247 · 3.0 T</w:t>
             </w:r>
           </w:p>
         </w:tc>
@@ -2394,7 +2394,7 @@
               <w:rPr>
                 <w:sz w:val="15"/>
               </w:rPr>
-              <w:t>€476 / €1,480 · test</w:t>
+              <w:t>€476 / €1,480 · 0.5 T</w:t>
             </w:r>
           </w:p>
         </w:tc>
@@ -2411,7 +2411,7 @@
               <w:rPr>
                 <w:sz w:val="15"/>
               </w:rPr>
-              <w:t>€109 / €269 · backup</w:t>
+              <w:t>€109 / €269 · 2.8 T</w:t>
             </w:r>
           </w:p>
         </w:tc>
@@ -2428,7 +2428,7 @@
               <w:rPr>
                 <w:sz w:val="15"/>
               </w:rPr>
-              <w:t>€375 / €1,282 · test</w:t>
+              <w:t>€375 / €1,282 · 0.6 T</w:t>
             </w:r>
           </w:p>
         </w:tc>
@@ -2445,7 +2445,7 @@
               <w:rPr>
                 <w:sz w:val="15"/>
               </w:rPr>
-              <w:t>€425 / €1,587 · test</w:t>
+              <w:t>€425 / €1,587 · 0.5 T</w:t>
             </w:r>
           </w:p>
         </w:tc>
@@ -2498,7 +2498,7 @@
               <w:rPr>
                 <w:sz w:val="15"/>
               </w:rPr>
-              <w:t>€126 / €310 · test</w:t>
+              <w:t>€126 / €310 · 2.4 T</w:t>
             </w:r>
           </w:p>
         </w:tc>
@@ -2515,7 +2515,7 @@
               <w:rPr>
                 <w:sz w:val="15"/>
               </w:rPr>
-              <w:t>€210 / €716 · test</w:t>
+              <w:t>€210 / €716 · 1.0 T</w:t>
             </w:r>
           </w:p>
         </w:tc>
@@ -2602,7 +2602,7 @@
               <w:rPr>
                 <w:sz w:val="15"/>
               </w:rPr>
-              <w:t>€175 / €598 · 10.2</w:t>
+              <w:t>€175 / €598 · 8.6</w:t>
             </w:r>
           </w:p>
         </w:tc>
@@ -2793,7 +2793,7 @@
               <w:rPr>
                 <w:sz w:val="15"/>
               </w:rPr>
-              <w:t>€308 / €1,000 · 0.9</w:t>
+              <w:t>€308 / €1,000 · 0.4</w:t>
             </w:r>
           </w:p>
         </w:tc>
@@ -2829,7 +2829,7 @@
               <w:rPr>
                 <w:sz w:val="15"/>
               </w:rPr>
-              <w:t>€322 / €1,001 · 2.1</w:t>
+              <w:t>€322 / €1,001 · 0.9</w:t>
             </w:r>
           </w:p>
         </w:tc>
@@ -2896,7 +2896,7 @@
         <w:rPr>
           <w:sz w:val="16"/>
         </w:rPr>
-        <w:t>Cells show cost per qualified / cost per hire · hires planned. Cost per hire includes set-up costs (I2 €1,200, I3 €400 translation). StepStone's planned cost per hire is €1,385 because ads are bought whole. Paid cost per application ranges from €12 (Polish boards; €19.50 with the pre-screen call) to €97 (StepStone, at 15 applications per ad); rediscovery costs €4. Sources: StepStone €1,449 per ad (instaffo.com), Pracuj.pl ~1,499 PLN per ad, indicative (dlafirm.pracuj.pl), Indeed CPC $0.10–5+ (pin.com), LinkedIn CPC $4–8 (peoplebox.ai), Appcast apply rate 6.1% (2025 benchmark). All other figures are my own estimates.</w:t>
+        <w:t>Cells show cost per qualified / cost per hire · hires planned (T = the €750 test only). Cost per hire includes set-up costs (I2 €1,200, I3 €400 translation). The single StepStone ad works out at €1,583 per hire because it is bought whole. Paid cost per application ranges from €12 (Polish boards; €19.50 with the pre-screen call) to €97 (StepStone, at 15 applications per ad); rediscovery costs €4. Sources: StepStone €1,449 per ad (instaffo.com), Pracuj.pl ~1,499 PLN per ad, indicative (dlafirm.pracuj.pl), Indeed CPC $0.10–5+ (pin.com), LinkedIn CPC $4–8 (peoplebox.ai), Appcast apply rate 6.1% (2025 benchmark). All other figures are my own estimates.</w:t>
       </w:r>
     </w:p>
     <w:p>
@@ -2907,7 +2907,7 @@
         <w:t xml:space="preserve">What the ranking says. </w:t>
       </w:r>
       <w:r>
-        <w:t>Mechatronics is cheap and deep: programmatic (€269 per hire, ~53 hires of capacity) is unused only because cheaper sources (Polish corridor €221, Meta €247) cover the need, so it's the first place the reserve goes if organic or Polish volume falls short. Electricians are the opposite: every source beyond the first ~8 hires costs €650–1,500.</w:t>
+        <w:t>For mechatronics, programmatic, Meta and Search run only their tests, because free sources, rediscovery and the Polish corridor (€228 per hire) cover the need. Together they have ~80 more hires of capacity at €247–310, so the reserve goes there first if organic or Polish volume falls short. Electricians are the opposite: beyond the first ~8 hires (organic and rediscovery), every source costs €650–1,500.</w:t>
       </w:r>
     </w:p>
     <w:p>
@@ -2918,7 +2918,7 @@
         <w:t xml:space="preserve">Allocation. </w:t>
       </w:r>
       <w:r>
-        <w:t>€43.6k planned = €17.9k paid channels + €18.0k initiative media, pre-screen calls and referral bonuses + €1.6k set-up + €6.1k of €750 tests on cells outside the plan. The reserve is €8.9k: 15% of the €51.3k calculated total (€7.7k) plus €1.2k from rounding up to €52.5k. It stays unallocated until week 3. CPC/CPA media follows 13%, 18%, 18%, 18%, 18%, 15% across weeks 1–6 (Tue–Mon), and supervisor spend ends in week 5. StepStone ads and set-up are paid in week 1, tests across weeks 1–2, and referral bonuses as hires sign (weeks 4–9). Weeks 1–2 cash is €19.6k (37%), of which €6.1k is test money and €2.9k is StepStone ads. On Mon 2 Nov we cut planned cells that break the rules once they pass €500 or 30 applications; tests and the full re-allocation are judged on Mon 9 Nov.</w:t>
+        <w:t>€38.7k planned = €20.4k paid channels (including €9.0k of tests: €750 in each of 12 paid cells) + €16.7k initiative media, pre-screen calls and referral bonuses + €1.6k set-up. The reserve is €8.8k: 15% of the €45.6k calculated total (€6.8k) plus €1.9k from rounding up to €47.5k. It stays unallocated until week 3. Spend after tests follows 6%, 12%, 21%, 21%, 21%, 19% across weeks 1–6 (Tue–Mon); weeks 1–2 are low because the tests already fill those slots. Supervisor spend ends in week 5. StepStone and set-up are paid in week 1, tests across weeks 1–2, and referral bonuses as hires sign (weeks 4–9). Weeks 1–2 cash is €16.2k (34%), of which €9.0k is tests. From Mon 2 Nov we cut planned cells that break the rules once they pass €500 or 30 applications; tests and the full re-allocation are judged by Mon 9 Nov.</w:t>
       </w:r>
     </w:p>
     <w:p>
@@ -2929,7 +2929,7 @@
         <w:t xml:space="preserve">With less money. </w:t>
       </w:r>
       <w:r>
-        <w:t>Media is cut from the most expensive cost per hire first, and the reserve stays at 15%. At –15% (€44.6k) we sign ~95; at –30% (€36.75k) ~87, with electricians at 19 and supervisors at 8; at –50% (€26.25k) ~76. Mechatronics and automation never fall short. What I'd tell the client: the last €15.75k buys ~13 hires at ~€1,250 each, mostly electricians. That is cheap compared with one week of an unfilled maintenance shift, so keep it. If you must cut, cover supervisors with internal promotions and protect electricians.</w:t>
+        <w:t>The most expensive cost-per-hire cells are cut first, including their tests and set-up, and the reserve stays at 15%. At –15% (€40.4k) we sign ~97; at –30% (€33.25k) ~91, with electricians at 23, automation at 14 and supervisors at 8; at –50% (€23.75k) ~82. Mechatronics never falls short. What I'd tell the client: the last €14.25k buys ~9 hires at ~€1,550 each, mostly electricians, the role that keeps the lines running. If you must cut, cover supervisors with internal promotions and protect electricians.</w:t>
       </w:r>
     </w:p>
     <w:p>
@@ -2942,7 +2942,7 @@
           <w:color w:val="1F3864"/>
           <w:sz w:val="23"/>
         </w:rPr>
-        <w:t>Part 3: New sources (all funded inside the €52.5k)</w:t>
+        <w:t>Part 3: New sources (all funded inside the €47.5k)</w:t>
       </w:r>
     </w:p>
     <w:tbl>
@@ -3210,7 +3210,7 @@
               <w:rPr>
                 <w:sz w:val="15"/>
               </w:rPr>
-              <w:t>Already screened (50% qualified vs 8–15%), already wanted Tesla, nearly free (€4 per application)</w:t>
+              <w:t>Already screened (50% qualified vs 5–35% on paid channels), already wanted Tesla, nearly free (€4 per application)</w:t>
             </w:r>
           </w:p>
         </w:tc>
@@ -3280,7 +3280,7 @@
               <w:rPr>
                 <w:sz w:val="15"/>
               </w:rPr>
-              <w:t>€350 messaging + €5.1k bonuses → 84 re-applications + 32 referrals, ~56 qualified, ~22 hires (~€21 per hire for rediscovery, €1,000 for referrals)</w:t>
+              <w:t>€350 messaging + €4.6k bonuses → 84 re-applications + 28 referrals, ~55 qualified, ~21 hires (~€21 per hire for rediscovery, €1,000 for referrals)</w:t>
             </w:r>
           </w:p>
         </w:tc>
@@ -3314,7 +3314,7 @@
               <w:rPr>
                 <w:sz w:val="15"/>
               </w:rPr>
-              <w:t>184 apps × (€12 ads + €7.50 call) = €3.6k + €0.4k translation → 40 qualified × 44.6% = 18 hires (the 40% cap; €221 per hire)</w:t>
+              <w:t>141 apps × (€12 ads + €7.50 call) = €2.7k + €0.4k translation → 31 qualified × 44.6% = 13.8 hires (31% of mechatronics, under the 40% cap; €228 per hire)</w:t>
             </w:r>
           </w:p>
         </w:tc>
@@ -3350,7 +3350,7 @@
               <w:rPr>
                 <w:sz w:val="15"/>
               </w:rPr>
-              <w:t>€350 of messaging (bonuses are paid only on signed hires, from week 4). Works if ≥15 qualified (≥5 electricians) by day 14. Kill: &lt;5 qualified → stop the waves; the bonus stays because it costs only on a hire</w:t>
+              <w:t>€350 of messaging (bonuses are paid only on signed hires, from week 4). Works if ≥15 qualified (≥5 electricians) by day 14; ~30 are expected. Kill: &lt;5 qualified → stop the waves; the bonus stays because it costs only on a hire</w:t>
             </w:r>
           </w:p>
         </w:tc>
@@ -3367,7 +3367,7 @@
               <w:rPr>
                 <w:sz w:val="15"/>
               </w:rPr>
-              <w:t>€4.0k. Works if ≥8 qualified at ≤€250 each by day 14, and in week 4 ≥50% of the first 6 interviewed pass. Kill: &gt;€400 per qualified or profile rejected (day 14), or &lt;40% pass (week 4) → money to StepStone/programmatic</w:t>
+              <w:t>€2.8k (€1.2k set-up + €1.6k media). Works if ≥6 qualified at ≤€250 each by day 14 (plan ≈8 at €200), and in week 4 ≥50% of the first 6 interviewed pass. Kill: &gt;€400 per qualified or profile rejected (day 14), or &lt;40% pass (week 4) → money to StepStone/programmatic</w:t>
             </w:r>
           </w:p>
         </w:tc>
@@ -3384,7 +3384,7 @@
               <w:rPr>
                 <w:sz w:val="15"/>
               </w:rPr>
-              <w:t>€1.5k. Works if ≥12 qualified at ≤€80 each. Kill: &lt;6 qualified or &lt;30% pass the language check → stop ads and the freelancer's hours</w:t>
+              <w:t>€1.0k. Works if ≥5 qualified at ≤€90 each by day 14 (plan ≈7 at €89). Kill: &lt;3 qualified or &lt;30% pass the language check → stop ads and the freelancer's hours</w:t>
             </w:r>
           </w:p>
         </w:tc>
@@ -3420,7 +3420,7 @@
               <w:rPr>
                 <w:sz w:val="15"/>
               </w:rPr>
-              <w:t>Me: segment the export and send wave 1 within a day of receiving it; DE copy, tracked links and the 3-wave sequence ready in 3 days. Client: ATS export + consent check, bonus approval, one intranet/shift-briefing message</w:t>
+              <w:t>Me: segment the export and send wave 1 on day 2 (Wed 21 Oct); waves 2–3 copy and tracked links ready by day 3. Client: ATS export + consent check, bonus approval, one intranet/shift-briefing message</w:t>
             </w:r>
           </w:p>
         </w:tc>
@@ -3473,7 +3473,7 @@
         <w:t xml:space="preserve">Which could become a Joveo product: </w:t>
       </w:r>
       <w:r>
-        <w:t>I1a ATS rediscovery. Every large employer has thousands of previously screened candidates sitting in its ATS, and in my experience they are rarely re-marketed to. Here they cost ~€20 per hire against €220–1,500 for other sources, and they're available on day 1 when paid channels are still warming up. That is exactly when the 55 slots would otherwise sit empty. Joveo already matches jobs to supply programmatically. Adding a 'rediscovery' source that matches open reqs to past qualified applicants, re-contacts them with consent and tracks them to hire through the same source tags is a repeatable product priced per qualified applicant, and it works in any market without local staff. The Polish corridor is the second candidate, as a reusable cross-border supply lane with pay-per-call pre-screening.</w:t>
+        <w:t>I1a ATS rediscovery. Every large employer has thousands of previously screened candidates sitting in its ATS, and in my experience they are rarely re-marketed to. Here they cost ~€20 per hire against €220–1,600 for other sources, and they're available on day 1 when paid channels are still warming up. That is exactly when the 55 slots would otherwise sit empty. Joveo already matches jobs to supply programmatically. Adding a 'rediscovery' source that matches open reqs to past qualified applicants, re-contacts them with consent and tracks them to hire through the same source tags is a repeatable product priced per qualified applicant, and it works in any market without local staff. The Polish corridor is the second candidate, as a reusable cross-border supply lane with pay-per-call pre-screening.</w:t>
       </w:r>
     </w:p>
     <w:p>
@@ -3497,7 +3497,7 @@
         <w:t xml:space="preserve">Track. </w:t>
       </w:r>
       <w:r>
-        <w:t>Every Monday, by source × role: spend, clicks, applications, qualified, assessed, passed, offers, signed, cost per qualified, cost per hire, days in stage, and slot use (assessed vs 55). Data comes from the Joveo platform (spend, clicks, applies by tracked URL), a Monday ATS export with the utm source carried into the ATS source field, recruiter disposition codes, and the Polish pre-screener's sheet. A report goes out every Tuesday. The Tracker tab turns actuals into decisions and a hire forecast automatically.</w:t>
+        <w:t>Every Monday, by source × role: spend, clicks, applications, qualified, assessed, interviewed, passed, offers, signed, cost per qualified, cost per hire, days in stage, and slot use (assessed vs 55). Data comes from the Joveo platform (spend, clicks, applies by tracked URL), a Monday ATS export with the utm source carried into the ATS source field, recruiter disposition codes, and the Polish pre-screener's sheet. A report goes out every Tuesday. The Tracker tab turns actuals into decisions and a hire forecast automatically.</w:t>
       </w:r>
     </w:p>
     <w:p>
@@ -3516,7 +3516,7 @@
         <w:rPr>
           <w:b/>
         </w:rPr>
-        <w:t>Checks on my assumptions:</w:t>
+        <w:t>End-of-week-2 checks (Mon 2 Nov, confirmed Mon 9 Nov):</w:t>
       </w:r>
       <w:r/>
     </w:p>
@@ -3530,10 +3530,10 @@
         <w:rPr>
           <w:b/>
         </w:rPr>
-        <w:t>Qualified → pass rate by role:</w:t>
+        <w:t>Qualified → pass rate by role.</w:t>
       </w:r>
       <w:r>
-        <w:t xml:space="preserve"> Week 2 (Mon 9 Nov; the first interviews are from ~29 Oct). This is the most sensitive assumption. If it is below 45% across roles: tighten knock-out questions, add pre-screen calls for electricians, ask for +10 slots a week, and shift spend toward rediscovery, referrals and StepStone. Re-run the model with the actual rate to show the client the new ceiling.</w:t>
+        <w:t xml:space="preserve"> Read on the week-1 cohort, whose interviews run 29 Oct–2 Nov. This is the most sensitive assumption. If it is below 45% across roles: tighten knock-out questions, add pre-screen calls for electricians, ask for +10 slots a week, and shift spend toward rediscovery, referrals and StepStone. Re-run the model with the actual rate to show the client the new ceiling.</w:t>
       </w:r>
     </w:p>
     <w:p>
@@ -3546,10 +3546,10 @@
         <w:rPr>
           <w:b/>
         </w:rPr>
-        <w:t>Electrician share qualified and I2's result:</w:t>
+        <w:t>Electrician share qualified and I2's day-14 result.</w:t>
       </w:r>
       <w:r>
-        <w:t xml:space="preserve"> Week 2 (Mon 9 Nov). If the EGT profile is rejected or I2 is below 10% qualified, move I2 and reserve money into StepStone (2 more ads) and programmatic for electricians, and tell the client to expect ~25–27 electricians.</w:t>
+        <w:t xml:space="preserve"> If the EGT profile is rejected or I2 is below 10% qualified, move I2 and reserve money into StepStone (up to 2 more ads) and programmatic for electricians, and tell the client to expect ~25–27 electricians.</w:t>
       </w:r>
     </w:p>
     <w:p>
@@ -3562,10 +3562,21 @@
         <w:rPr>
           <w:b/>
         </w:rPr>
-        <w:t>Offer speed and acceptance:</w:t>
+        <w:t>Paid-channel costs and share qualified.</w:t>
       </w:r>
       <w:r>
-        <w:t xml:space="preserve"> Week 4 (Mon 16 Nov; the first signatures arrive from ~8 Nov). If acceptance is below 55% or offer → signature takes more than 10 days, pull the application cut-off a week earlier, move spend into weeks 4–5, and propose a signing bonus for contracts signed before 18 Dec.</w:t>
+        <w:t xml:space="preserve"> Compare the 12 tests' cost per application and share qualified with plan. Re-rank the cells by entering the updated values on Assumptions §7; the cheapest ones with capacity get the reserve from week 3.</w:t>
+      </w:r>
+    </w:p>
+    <w:p>
+      <w:r>
+        <w:rPr>
+          <w:b/>
+        </w:rPr>
+        <w:t xml:space="preserve">Week-4 check. </w:t>
+      </w:r>
+      <w:r>
+        <w:t>Offer acceptance and speed can't be read until signatures start in week 4 (10 Nov). On Mon 16 Nov: if acceptance is below 55% or offer → signature takes more than 10 days, pull the cut-off a week earlier, move spend into weeks 4–5, and propose a signing bonus for contracts signed before 18 Dec.</w:t>
       </w:r>
     </w:p>
     <w:p>
@@ -3592,7 +3603,7 @@
         <w:spacing w:after="20"/>
       </w:pPr>
       <w:r>
-        <w:t>Tue–Wed: launch every planned cell with tracked URLs and knock-out questions (careers/BA/Google for Jobs check, Google Search, LinkedIn, Meta and programmatic tests, 2 StepStone ads for electricians).</w:t>
+        <w:t>Tue–Wed: launch every planned cell and the €750 tests with tracked URLs and knock-out questions (careers/BA/Google for Jobs check, Google Search, LinkedIn, Meta, programmatic, 1 StepStone ad for electricians).</w:t>
       </w:r>
     </w:p>
     <w:p>
@@ -3619,7 +3630,7 @@
         <w:spacing w:after="20"/>
       </w:pPr>
       <w:r>
-        <w:t>Mon 26 Oct: first tracker read-out. Check week-2 qualified volume against 55, confirm the assessment calendar, and pre-book the reserve moves for 2 Nov.</w:t>
+        <w:t>Mon 26 Oct: first tracker read-out. Check week-2 qualified volume against 55, confirm the assessment calendar, and line up the 2 Nov decisions.</w:t>
       </w:r>
     </w:p>
     <w:sectPr>

</xml_diff>